<commit_message>
update social policy and general update
</commit_message>
<xml_diff>
--- a/paper.docx
+++ b/paper.docx
@@ -31,7 +31,7 @@
         <w:pStyle w:val="Abstract"/>
       </w:pPr>
       <w:r>
-        <w:t xml:space="preserve">This study</w:t>
+        <w:t xml:space="preserve">Digital technologies are transforming the standard employment relationship around which social protection was built, yet far less is known about how workers’ labour-market position and their anticipation of technological change shape the perceived justice of their exchange with the welfare state. Drawing on the 2024 wave of the OECD Risks That Matter survey (19,169 respondents in 27 countries), this article examines whether perceived redistributive justice, the judgement that one receives a fair share given what one contributes, is anchored in type of employment, job insecurity, technological perceptions and the perceived deservingness of others, and whether welfare regimes condition these relationships. Preregistered hypotheses are tested with multilevel cumulative-link models with random country intercepts. Three individual-level expectations hold: concern about losing one’s job or income and the perception that others receive undeserved benefits depress perceived justice, while perceiving technology as enabling raises it. Two do not: platform workers judge their exchange as more just rather than less, and perceived technological displacement risk increases rather than erodes perceived justice. Welfare regimes do not differ on average, but the moderation analyses reveal a consistent institutional patterning: every regime interaction is negative, the platform and displacement associations are steepest under liberal arrangements and flattest under social-democratic ones, self-employment becomes consequential only in social-democratic regimes, and deservingness judgements weigh most heavily in conservative regimes. The findings underline the analytical distinction between redistributive preferences and justice perceptions, and recast the regime effect as one of decoupling: universalist institutions weaken the translation of platform work and technological perception into judgements of justice, whereas residual arrangements bind them together. These results bear on the European agenda on access to social protection for non-standard and platform workers: extending coverage raises what is at stake in the exchange, and its legitimacy returns will depend on entitlements being proportionate and legible.</w:t>
       </w:r>
       <w:r>
         <w:t xml:space="preserve"> </w:t>
@@ -47,7 +47,7 @@
         <w:t xml:space="preserve">Keywords</w:t>
       </w:r>
       <w:r>
-        <w:t xml:space="preserve">: Redistributive preferences, Labor market position, Welfare State</w:t>
+        <w:t xml:space="preserve">: Redistributive justice, Labor market position, Welfare regimes, platform work, technological change</w:t>
       </w:r>
     </w:p>
     <w:bookmarkStart w:id="22" w:name="introduction"/>
@@ -293,7 +293,7 @@
         <w:pStyle w:val="BodyText"/>
       </w:pPr>
       <w:r>
-        <w:t xml:space="preserve">This study addresses whether perceiving the functioning of the state as just is related to labour market position and the perception of technological risk. Drawing on data from the Risks That Matter survey of the OECD (2024), which covers more than 40,000 people in 27 countries, most of them European, this research places European welfare states in comparative perspective and simultaneously introduces three little-explored elements. First, it distinguishes labour market position according to type of employment —formal employees, self-employed workers and platform workers—, forms that maintain unequal links with the social protection system and that have rarely been examined together in relation to perceived redistributive justice. Second, it incorporates the perception of technological risk as a source of redistributive dissatisfaction distinct from type of employment and from conventional job insecurity, distinguishing its threatening dimension —the likelihood of being displaced by technology— from its enabling dimension —the perception that technology can improve working conditions—. Third, it incorporates the perceived deservingness of others —the judgement of whether others receive benefits from the state that they do not deserve— as a predictor of the assessment that each individual makes of their own relationship with the system</w:t>
+        <w:t xml:space="preserve">This study addresses whether perceiving the functioning of the state as just is related to labour market position and the perception of technological risk. Drawing on data from the Risks That Matter survey of the OECD (2024), which covers more than 27,000 people in 27 countries, this research places European welfare states in comparative perspective and simultaneously introduces three little-explored elements. First, it distinguishes labour market position according to type of employment —formal employees, self-employed workers and platform workers—, forms that maintain unequal links with the social protection system and that have rarely been examined together in relation to perceived redistributive justice. Second, it incorporates the perception of technological risk as a source of redistributive dissatisfaction distinct from type of employment and from conventional job insecurity, distinguishing its threatening dimension —the likelihood of being displaced by technology— from its enabling dimension —the perception that technology can improve working conditions—. Third, it incorporates the perceived deservingness of others —the judgement of whether others receive benefits from the state that they do not deserve— as a predictor of the assessment that each individual makes of their own relationship with the system</w:t>
       </w:r>
       <w:r>
         <w:t xml:space="preserve"> </w:t>
@@ -632,7 +632,7 @@
         <w:t xml:space="preserve">)</w:t>
       </w:r>
       <w:r>
-        <w:t xml:space="preserve">.</w:t>
+        <w:t xml:space="preserve">, and social cohesion is affected.</w:t>
       </w:r>
     </w:p>
     <w:p>
@@ -1338,7 +1338,7 @@
         <w:pStyle w:val="FirstParagraph"/>
       </w:pPr>
       <w:r>
-        <w:t xml:space="preserve">Beyond type of employment, the level of job insecurity experienced by workers constitutes a distinct dimension of vulnerability. Job insecurity is defined as the subjective assessment of the likelihood of losing one’s own job or self-employment income in the short term, with the chronic uncertainty and anticipatory anxiety this entails</w:t>
+        <w:t xml:space="preserve">Beyond type of employment, the level of job insecurity experienced by workers constitutes a distinct dimension of vulnerability. Job insecurity is defined as the subjective assessment of the concern of losing one’s own job or self-employment income in the short term, with the chronic uncertainty and anticipatory anxiety this entails</w:t>
       </w:r>
       <w:r>
         <w:t xml:space="preserve"> </w:t>
@@ -1610,7 +1610,7 @@
         <w:t xml:space="preserve">)</w:t>
       </w:r>
       <w:r>
-        <w:t xml:space="preserve">. What matters for welfare attitudes is not the objective magnitude of that process, but the way in which workers anticipate its effects on their own job</w:t>
+        <w:t xml:space="preserve">. What matters for welfare attitudes is the objective magnitude of that process, and also the way in which workers anticipate its effects on their own job</w:t>
       </w:r>
       <w:r>
         <w:t xml:space="preserve"> </w:t>
@@ -1964,7 +1964,7 @@
         <w:pStyle w:val="FirstParagraph"/>
       </w:pPr>
       <w:r>
-        <w:t xml:space="preserve">Perceptions of redistributive justice do not depend solely on structural position, but also on the normative frameworks through which individuals assess who and what deserves to receive from the state. Deservingness theory holds that people direct their solidarity towards the groups they consider deserving and withdraw it from those they judge undeserving, on the basis of criteria such as control over one’s own situation, attitude, reciprocity, identity and need</w:t>
+        <w:t xml:space="preserve">Perceptions of redistributive justice do not depend solely on structural position, but also on the normative frameworks through which individuals assess who and what deserves to receive from the state. Deservingness literature holds that people direct their solidarity towards the groups they consider deserving and withdraw it from those they judge undeserving, on the basis of criteria such as control over one’s own situation, attitude, reciprocity, identity and need</w:t>
       </w:r>
       <w:r>
         <w:t xml:space="preserve"> </w:t>
@@ -2477,7 +2477,7 @@
         <w:pStyle w:val="BodyText"/>
       </w:pPr>
       <w:r>
-        <w:t xml:space="preserve">The institutional context not only shifts the average level of perceptions, but may moderate the effect of individual predictors. The institutional distance between workers in non-formal employment and the protection system is greater in liberal and conservative regimes than in social democratic ones, which are universalist in character</w:t>
+        <w:t xml:space="preserve">The institutional context shifts the average level of perceptions, and may moderate the effect of individual predictors. The institutional distance between workers in non-formal employment and the protection system is greater in liberal and conservative regimes than in social democratic ones, which are universalist in character</w:t>
       </w:r>
       <w:r>
         <w:t xml:space="preserve"> </w:t>
@@ -2567,7 +2567,7 @@
         <w:pStyle w:val="BodyText"/>
       </w:pPr>
       <w:r>
-        <w:t xml:space="preserve">An analogous expectation can be formulated for the perception of technological risk. In universalist regimes, protection against the risks associated with digitalisation is more robust and less dependent on the individual employment trajectory, which could cushion the effect of perceived displacement risk on the assessment of the fiscal exchange</w:t>
+        <w:t xml:space="preserve">An analogous expectation can be formulated for the perception of technological risk. In universalist regimes, protection against the risks associated with digitalisation is more robust and less dependent on the individual employment trajectory, which could moderate the effect of perceived displacement risk on the assessment of the fiscal exchange</w:t>
       </w:r>
       <w:r>
         <w:t xml:space="preserve"> </w:t>
@@ -2758,7 +2758,7 @@
     </w:tbl>
     <w:bookmarkEnd w:id="21"/>
     <w:bookmarkEnd w:id="22"/>
-    <w:bookmarkStart w:id="27" w:name="data-variables-and-methods"/>
+    <w:bookmarkStart w:id="28" w:name="data-variables-and-methods"/>
     <w:p>
       <w:pPr>
         <w:pStyle w:val="Heading1"/>
@@ -2787,7 +2787,7 @@
         <w:t xml:space="preserve"> </w:t>
       </w:r>
       <w:r>
-        <w:t xml:space="preserve">This study uses data from the Risks That Matter (RTM) survey of the OECD, a cross-national public opinion survey applied in 27 member countries of the Organisation for Economic Co-operation and Development. The most recent wave (2024) is used, which includes more than 40,000 people across 27 OECD countries: Australia, Austria, Belgium, Canada, Chile, Colombia, Costa Rica, the Czech Republic, Denmark, Estonia, Finland, France, Germany, Greece, Hungary, Ireland, Israel, Italy, Japan, Korea, Lithuania, Mexico, the Netherlands, New Zealand, Poland, Portugal and the United States. The survey collects nationally representative data on adults aged between 18 and 64, using stratified sampling with post-stratification weights calibrated by age, sex, region and educational level. The 2024 wave is especially relevant for this study because it captures attitudes in the period following the COVID-19 pandemic, an episode that dramatically accelerated the digitalisation of work, expanded platform employment and exposed the cracks in the social insurance systems of the OECD countries.</w:t>
+        <w:t xml:space="preserve">This study uses data from the most recent wave (2024) of the Risks That Matter (RTM) survey of the OECD, a cross-national public opinion survey that includes 27,229 people aged 18 to 64 in 27 member countries: Austria, Belgium, Canada, Chile, Denmark, Estonia, Finland, France, Germany, Greece, Ireland, Israel, Italy, Korea, Latvia, Lithuania, Mexico, the Netherlands, Norway, Poland, Portugal, Slovenia, Spain, Switzerland, Türkiye, the United Kingdom and the United States. The survey collects nationally representative data using stratified sampling with post-stratification weights calibrated by age, sex, region and educational level. The 2024 wave is especially relevant for this study because it captures attitudes in the period following the COVID-19 pandemic, which accelerated the digitalisation of work and expanded platform employment.</w:t>
       </w:r>
     </w:p>
     <w:bookmarkEnd w:id="23"/>
@@ -2814,7 +2814,7 @@
         <w:t xml:space="preserve">“I feel that I receive a fair share of public benefits, given the taxes and social contributions that I pay and/or have paid in the past”</w:t>
       </w:r>
       <w:r>
-        <w:t xml:space="preserve">, answered on a five-point Likert scale ranging from strongly disagree to strongly agree. This item captures the person’s evaluative judgement of the justice of the exchange with the state and is treated as an ordinal variable in all the analyses.</w:t>
+        <w:t xml:space="preserve">, answered on a five-point Likert scale ranging from strongly disagree to strongly agree, and is treated as an ordinal variable in all the analyses.</w:t>
       </w:r>
     </w:p>
     <w:p>
@@ -2822,16 +2822,25 @@
         <w:pStyle w:val="BodyText"/>
       </w:pPr>
       <w:r>
-        <w:t xml:space="preserve">Three sets of independent variables constitute the core of the analysis. The first concerns labour market position and job insecurity. Type of employment is operationalised as a three-category variable distinguishing formal waged employment (permanent or long-term dependent employment), platform work (work mediated by digital platforms) and self-employment. Job insecurity is measured by the item:</w:t>
-      </w:r>
-      <w:r>
-        <w:t xml:space="preserve"> </w:t>
-      </w:r>
-      <w:r>
-        <w:t xml:space="preserve">“How likely do you think it is that you could lose your job or your self-employment income in the next 12 months?”</w:t>
-      </w:r>
-      <w:r>
-        <w:t xml:space="preserve">, with response categories ranging from very unlikely to very likely. This item captures the subjective, anticipatory dimension of precarity: workers’ sense of how exposed they are to income loss in the short term.</w:t>
+        <w:t xml:space="preserve">Three sets of independent variables constitute the core of the analysis. The first concerns labour market position and job insecurity. Type of employment is operationalised as a three-category variable distinguishing formal waged employment (permanent or long-term dependent employment), platform work (work mediated by digital platforms) and self-employment. Job insecurity is measured by the item</w:t>
+      </w:r>
+      <w:r>
+        <w:t xml:space="preserve"> </w:t>
+      </w:r>
+      <w:r>
+        <w:t xml:space="preserve">“Losing a job or self-employment income”</w:t>
+      </w:r>
+      <w:r>
+        <w:t xml:space="preserve">, asked within the battery</w:t>
+      </w:r>
+      <w:r>
+        <w:t xml:space="preserve"> </w:t>
+      </w:r>
+      <w:r>
+        <w:t xml:space="preserve">“Thinking about the next year or two, how concerned are you about each of the following?”</w:t>
+      </w:r>
+      <w:r>
+        <w:t xml:space="preserve">, with response categories ranging from not at all concerned to very concerned.</w:t>
       </w:r>
     </w:p>
     <w:p>
@@ -2839,7 +2848,16 @@
         <w:pStyle w:val="BodyText"/>
       </w:pPr>
       <w:r>
-        <w:t xml:space="preserve">The second set of variables captures the perception of technological change with respect to one’s own job. These variables are measured through a battery that asks: “How likely do you think it is that the following will happen in your job (or job opportunities) in the next five years?”, with items rated on a four-point probability scale. The battery includes four displacement items —the likelihood that the job will be replaced by a robot, that it will be replaced by an artificial intelligence tool such as ChatGPT, and that it will be replaced by a person offering a similar service through an internet platform, and the likelihood of losing the job through not being sufficiently technologically skilled— and three benefit items —that technology will make working hours more compatible with private life, that it will make work less dangerous or physically demanding, and that it will make it less boring, repetitive, stressful or mentally demanding. However, the exploratory factor analysis carried out on these seven items yields a three-factor structure: the three displacement items load on a first factor; the three benefit items load on a second factor; and the skill obsolescence item separates from both, so that it is retained as a single indicator, capturing an internal element of risk perception, distinct from the other two factors, which are considered external elements. Following the usual practice in constructing composite indices from attitudinal batteries, two scales are built —Technological Displacement Risk (the average of the three displacement items) and Perceived Technological Benefit (the average of the three benefit items)— and Perceived Skill Obsolescence is used as a single item. In all cases, higher values indicate a greater perception of the corresponding risk or benefit.</w:t>
+        <w:t xml:space="preserve">The second set of variables captures the perception of technological change with respect to one’s own job. These variables are measured through a battery that asks:</w:t>
+      </w:r>
+      <w:r>
+        <w:t xml:space="preserve"> </w:t>
+      </w:r>
+      <w:r>
+        <w:t xml:space="preserve">“How likely do you think it is that the following will happen in your job (or job opportunities) in the next five years?”</w:t>
+      </w:r>
+      <w:r>
+        <w:t xml:space="preserve">, with items rated on a four-point probability scale. The battery includes four displacement items —replacement of the job by a robot, by an artificial intelligence tool such as ChatGPT, or by a person offering a similar service through an internet platform, and the loss of the job through not being sufficiently technologically skilled— and three benefit items —that technology will make working hours more compatible with private life, make work less dangerous or physically demanding, and make it less boring, repetitive, stressful or mentally demanding. However, the exploratory factor analysis carried out on these seven items yields a three-factor structure: the three displacement items load on a first factor, the three benefit items on a second, and the skill obsolescence item separates from both, capturing an internal element of risk perception distinct from the two external ones. Two scales are therefore built —Technological Displacement Risk (the average of the three displacement items) and Perceived Technological Benefit (the average of the three benefit items)— and Perceived Skill Obsolescence is retained as a single item. In all cases, higher values indicate a greater perception of the corresponding risk or benefit.</w:t>
       </w:r>
     </w:p>
     <w:p>
@@ -2847,7 +2865,16 @@
         <w:pStyle w:val="BodyText"/>
       </w:pPr>
       <w:r>
-        <w:t xml:space="preserve">The third set of independent variables concerns the perceived deservingness of others, operationalised through the item that measures the degree of agreement with the statement «Many people receive public benefits without deserving them», rated on a five-point scale (1 = strongly disagree to 5 = strongly agree). Unlike the dependent variable, which captures the individual’s judgement of the justice of their own relationship with the system, this item captures their judgement of the deservingness of other beneficiaries, a central distinction in the literature on deservingness</w:t>
+        <w:t xml:space="preserve">The third set of independent variables concerns the perceived deservingness of others, operationalised through the item that measures the degree of agreement with the statement</w:t>
+      </w:r>
+      <w:r>
+        <w:t xml:space="preserve"> </w:t>
+      </w:r>
+      <w:r>
+        <w:t xml:space="preserve">“Many people receive public benefits without deserving them”</w:t>
+      </w:r>
+      <w:r>
+        <w:t xml:space="preserve">, rated on a five-point scale (1 = strongly disagree to 5 = strongly agree). Unlike the dependent variable, this item captures the judgement of the deservingness of other beneficiaries rather than of one’s own exchange with the system, a central distinction in the deservingness literature</w:t>
       </w:r>
       <w:r>
         <w:t xml:space="preserve"> </w:t>
@@ -2881,7 +2908,7 @@
         <w:t xml:space="preserve">)</w:t>
       </w:r>
       <w:r>
-        <w:t xml:space="preserve">. Higher values indicate a more widespread perception of undue deservingness on the part of third parties.</w:t>
+        <w:t xml:space="preserve">. Higher values indicate a stronger perception that others receive benefits without deserving them.</w:t>
       </w:r>
     </w:p>
     <w:p>
@@ -2889,7 +2916,30 @@
         <w:pStyle w:val="BodyText"/>
       </w:pPr>
       <w:r>
-        <w:t xml:space="preserve">The welfare regime is operationalised as a three-category variable (social democratic, liberal, conservative-corporatist) following</w:t>
+        <w:t xml:space="preserve">The welfare regime is operationalised as a three-category variable —social democratic, liberal and conservative-corporatist— following</w:t>
+      </w:r>
+      <w:r>
+        <w:t xml:space="preserve"> </w:t>
+      </w:r>
+      <w:r>
+        <w:t xml:space="preserve">Esping-Andersen (</w:t>
+      </w:r>
+      <w:hyperlink w:anchor="ref-esping-andersen_three_1993">
+        <w:r>
+          <w:rPr>
+            <w:rStyle w:val="Hyperlink"/>
+          </w:rPr>
+          <w:t xml:space="preserve">1993</w:t>
+        </w:r>
+      </w:hyperlink>
+      <w:r>
+        <w:t xml:space="preserve">)</w:t>
+      </w:r>
+      <w:r>
+        <w:t xml:space="preserve"> </w:t>
+      </w:r>
+      <w:r>
+        <w:t xml:space="preserve">and</w:t>
       </w:r>
       <w:r>
         <w:t xml:space="preserve"> </w:t>
@@ -2909,116 +2959,81 @@
         <w:t xml:space="preserve">)</w:t>
       </w:r>
       <w:r>
-        <w:t xml:space="preserve"> </w:t>
-      </w:r>
-      <w:r>
-        <w:t xml:space="preserve">and</w:t>
-      </w:r>
-      <w:r>
-        <w:t xml:space="preserve"> </w:t>
-      </w:r>
-      <w:r>
-        <w:t xml:space="preserve">Fenger (</w:t>
+        <w:t xml:space="preserve">. The countries of southern Europe and of central and eastern Europe are integrated into the conservative category, given the initial specificity of the post-socialist regimes and their progressive convergence towards the continental types</w:t>
+      </w:r>
+      <w:r>
+        <w:t xml:space="preserve"> </w:t>
+      </w:r>
+      <w:r>
+        <w:t xml:space="preserve">(</w:t>
       </w:r>
       <w:hyperlink w:anchor="ref-Fenger2006WelfareRI">
         <w:r>
           <w:rPr>
             <w:rStyle w:val="Hyperlink"/>
           </w:rPr>
-          <w:t xml:space="preserve">2006</w:t>
+          <w:t xml:space="preserve">Fenger, 2006</w:t>
         </w:r>
       </w:hyperlink>
       <w:r>
+        <w:t xml:space="preserve">;</w:t>
+      </w:r>
+      <w:r>
+        <w:t xml:space="preserve"> </w:t>
+      </w:r>
+      <w:hyperlink w:anchor="ref-ferrera_southern_1996">
+        <w:r>
+          <w:rPr>
+            <w:rStyle w:val="Hyperlink"/>
+          </w:rPr>
+          <w:t xml:space="preserve">Ferrera, 1996</w:t>
+        </w:r>
+      </w:hyperlink>
+      <w:r>
         <w:t xml:space="preserve">)</w:t>
       </w:r>
       <w:r>
-        <w:t xml:space="preserve">. To classify the countries of southern Europe and of central and eastern Europe present in the sample, the extensions of</w:t>
-      </w:r>
-      <w:r>
-        <w:t xml:space="preserve"> </w:t>
-      </w:r>
-      <w:r>
-        <w:t xml:space="preserve">Ferrera (</w:t>
-      </w:r>
-      <w:hyperlink w:anchor="ref-ferrera_southern_1996">
-        <w:r>
-          <w:rPr>
-            <w:rStyle w:val="Hyperlink"/>
-          </w:rPr>
-          <w:t xml:space="preserve">1996</w:t>
+        <w:t xml:space="preserve">, while the Baltic states, characterised by a more liberal orientation of their post-socialist reforms, are incorporated into the liberal regime</w:t>
+      </w:r>
+      <w:r>
+        <w:t xml:space="preserve"> </w:t>
+      </w:r>
+      <w:r>
+        <w:t xml:space="preserve">(</w:t>
+      </w:r>
+      <w:hyperlink w:anchor="ref-aidukaite_welfare_2011">
+        <w:r>
+          <w:rPr>
+            <w:rStyle w:val="Hyperlink"/>
+          </w:rPr>
+          <w:t xml:space="preserve">Aidukaite, 2011</w:t>
         </w:r>
       </w:hyperlink>
       <w:r>
         <w:t xml:space="preserve">)</w:t>
       </w:r>
       <w:r>
-        <w:t xml:space="preserve">,</w:t>
-      </w:r>
-      <w:r>
-        <w:t xml:space="preserve"> </w:t>
-      </w:r>
-      <w:r>
-        <w:t xml:space="preserve">Fenger (</w:t>
-      </w:r>
-      <w:hyperlink w:anchor="ref-Fenger2006WelfareRI">
-        <w:r>
-          <w:rPr>
-            <w:rStyle w:val="Hyperlink"/>
-          </w:rPr>
-          <w:t xml:space="preserve">2006</w:t>
+        <w:t xml:space="preserve">. Among the non-European countries, Chile and Mexico are classified as liberal, following the characterisation of their welfare regimes as market-centred</w:t>
+      </w:r>
+      <w:r>
+        <w:t xml:space="preserve"> </w:t>
+      </w:r>
+      <w:r>
+        <w:t xml:space="preserve">(</w:t>
+      </w:r>
+      <w:hyperlink w:anchor="ref-franzoni_welfare_2008">
+        <w:r>
+          <w:rPr>
+            <w:rStyle w:val="Hyperlink"/>
+          </w:rPr>
+          <w:t xml:space="preserve">Martínez Franzoni, 2008</w:t>
         </w:r>
       </w:hyperlink>
       <w:r>
         <w:t xml:space="preserve">)</w:t>
       </w:r>
       <w:r>
-        <w:t xml:space="preserve"> </w:t>
-      </w:r>
-      <w:r>
-        <w:t xml:space="preserve">and</w:t>
-      </w:r>
-      <w:r>
-        <w:t xml:space="preserve"> </w:t>
-      </w:r>
-      <w:r>
-        <w:t xml:space="preserve">Aidukaite (</w:t>
-      </w:r>
-      <w:hyperlink w:anchor="ref-aidukaite_welfare_2011">
-        <w:r>
-          <w:rPr>
-            <w:rStyle w:val="Hyperlink"/>
-          </w:rPr>
-          <w:t xml:space="preserve">2011</w:t>
-        </w:r>
-      </w:hyperlink>
-      <w:r>
-        <w:t xml:space="preserve">)</w:t>
-      </w:r>
-      <w:r>
-        <w:t xml:space="preserve"> </w:t>
-      </w:r>
-      <w:r>
-        <w:t xml:space="preserve">are followed, which document both the initial specificity of the post-socialist regimes and their progressive convergence towards the continental types after two decades of transition. On that basis, and given the small number of countries per category, the study adopts a three-regime classification —social democratic, liberal and conservative-corporatist—, in which the countries of southern Europe and of central and eastern Europe are integrated into the conservative category, while the Baltic states, characterised by a more liberal orientation of their post-socialist reforms, are incorporated into the liberal regime</w:t>
-      </w:r>
-      <w:r>
-        <w:t xml:space="preserve"> </w:t>
-      </w:r>
-      <w:r>
-        <w:t xml:space="preserve">(</w:t>
-      </w:r>
-      <w:hyperlink w:anchor="ref-aidukaite_welfare_2011">
-        <w:r>
-          <w:rPr>
-            <w:rStyle w:val="Hyperlink"/>
-          </w:rPr>
-          <w:t xml:space="preserve">Aidukaite, 2011</w:t>
-        </w:r>
-      </w:hyperlink>
-      <w:r>
-        <w:t xml:space="preserve">)</w:t>
-      </w:r>
-      <w:r>
-        <w:t xml:space="preserve">.</w:t>
+        <w:t xml:space="preserve">, while Israel, Korea and Türkiye are assigned to the conservative category. The full classification by country, with its sources, is reported in the appendix.</w:t>
       </w:r>
     </w:p>
     <w:p>
@@ -3026,7 +3041,7 @@
         <w:pStyle w:val="BodyText"/>
       </w:pPr>
       <w:r>
-        <w:t xml:space="preserve">All the models include a set of control variables that have been shown to be associated with attitudes towards the welfare state and perceived redistributive justice: sex, age, educational level (operationalised as the highest level of studies completed) and income decile (self-reported position in the national income distribution).</w:t>
+        <w:t xml:space="preserve">All the models include control variables associated with welfare attitudes and perceived redistributive justice: sex, age, educational level (highest level of studies completed) and income decile (self-reported position in the national income distribution).</w:t>
       </w:r>
     </w:p>
     <w:p>
@@ -3047,6 +3062,9 @@
           <w:t xml:space="preserve">Table 1</w:t>
         </w:r>
       </w:hyperlink>
+      <w:r>
+        <w:t xml:space="preserve">.</w:t>
+      </w:r>
     </w:p>
     <w:tbl>
       <w:tblPr>
@@ -3295,7 +3313,13 @@
                     <w:jc w:val="center"/>
                   </w:pPr>
                   <w:r>
-                    <w:t xml:space="preserve">All NA’s</w:t>
+                    <w:t xml:space="preserve">10293 (53.7%)</w:t>
+                  </w:r>
+                  <w:r>
+                    <w:br/>
+                  </w:r>
+                  <w:r>
+                    <w:t xml:space="preserve">8876 (46.3%)</w:t>
                   </w:r>
                 </w:p>
               </w:tc>
@@ -3308,13 +3332,13 @@
                     <w:jc w:val="center"/>
                   </w:pPr>
                   <w:r>
-                    <w:t xml:space="preserve">0</w:t>
+                    <w:t xml:space="preserve">19169</w:t>
                   </w:r>
                   <w:r>
                     <w:br/>
                   </w:r>
                   <w:r>
-                    <w:t xml:space="preserve">(0.0%)</w:t>
+                    <w:t xml:space="preserve">(100.0%)</w:t>
                   </w:r>
                 </w:p>
               </w:tc>
@@ -3379,7 +3403,31 @@
                     <w:jc w:val="center"/>
                   </w:pPr>
                   <w:r>
-                    <w:t xml:space="preserve">All NA’s</w:t>
+                    <w:t xml:space="preserve">2076 (10.8%)</w:t>
+                  </w:r>
+                  <w:r>
+                    <w:br/>
+                  </w:r>
+                  <w:r>
+                    <w:t xml:space="preserve">4522 (23.6%)</w:t>
+                  </w:r>
+                  <w:r>
+                    <w:br/>
+                  </w:r>
+                  <w:r>
+                    <w:t xml:space="preserve">4726 (24.7%)</w:t>
+                  </w:r>
+                  <w:r>
+                    <w:br/>
+                  </w:r>
+                  <w:r>
+                    <w:t xml:space="preserve">4486 (23.4%)</w:t>
+                  </w:r>
+                  <w:r>
+                    <w:br/>
+                  </w:r>
+                  <w:r>
+                    <w:t xml:space="preserve">3359 (17.5%)</w:t>
                   </w:r>
                 </w:p>
               </w:tc>
@@ -3392,13 +3440,13 @@
                     <w:jc w:val="center"/>
                   </w:pPr>
                   <w:r>
-                    <w:t xml:space="preserve">0</w:t>
+                    <w:t xml:space="preserve">19169</w:t>
                   </w:r>
                   <w:r>
                     <w:br/>
                   </w:r>
                   <w:r>
-                    <w:t xml:space="preserve">(0.0%)</w:t>
+                    <w:t xml:space="preserve">(100.0%)</w:t>
                   </w:r>
                 </w:p>
               </w:tc>
@@ -3451,7 +3499,19 @@
                     <w:jc w:val="center"/>
                   </w:pPr>
                   <w:r>
-                    <w:t xml:space="preserve">All NA’s</w:t>
+                    <w:t xml:space="preserve">1494 ( 7.8%)</w:t>
+                  </w:r>
+                  <w:r>
+                    <w:br/>
+                  </w:r>
+                  <w:r>
+                    <w:t xml:space="preserve">7913 (41.3%)</w:t>
+                  </w:r>
+                  <w:r>
+                    <w:br/>
+                  </w:r>
+                  <w:r>
+                    <w:t xml:space="preserve">9762 (50.9%)</w:t>
                   </w:r>
                 </w:p>
               </w:tc>
@@ -3464,13 +3524,13 @@
                     <w:jc w:val="center"/>
                   </w:pPr>
                   <w:r>
-                    <w:t xml:space="preserve">0</w:t>
+                    <w:t xml:space="preserve">19169</w:t>
                   </w:r>
                   <w:r>
                     <w:br/>
                   </w:r>
                   <w:r>
-                    <w:t xml:space="preserve">(0.0%)</w:t>
+                    <w:t xml:space="preserve">(100.0%)</w:t>
                   </w:r>
                 </w:p>
               </w:tc>
@@ -3623,7 +3683,7 @@
                     <w:jc w:val="center"/>
                   </w:pPr>
                   <w:r>
-                    <w:t xml:space="preserve">Self-empleoyment worker</w:t>
+                    <w:t xml:space="preserve">Self-employment worker</w:t>
                   </w:r>
                 </w:p>
               </w:tc>
@@ -3655,7 +3715,13 @@
                     <w:jc w:val="center"/>
                   </w:pPr>
                   <w:r>
-                    <w:t xml:space="preserve">All NA’s</w:t>
+                    <w:t xml:space="preserve">16459 (85.9%)</w:t>
+                  </w:r>
+                  <w:r>
+                    <w:br/>
+                  </w:r>
+                  <w:r>
+                    <w:t xml:space="preserve">2710 (14.1%)</w:t>
                   </w:r>
                 </w:p>
               </w:tc>
@@ -3668,13 +3734,13 @@
                     <w:jc w:val="center"/>
                   </w:pPr>
                   <w:r>
-                    <w:t xml:space="preserve">0</w:t>
+                    <w:t xml:space="preserve">19169</w:t>
                   </w:r>
                   <w:r>
                     <w:br/>
                   </w:r>
                   <w:r>
-                    <w:t xml:space="preserve">(0.0%)</w:t>
+                    <w:t xml:space="preserve">(100.0%)</w:t>
                   </w:r>
                 </w:p>
               </w:tc>
@@ -3721,7 +3787,13 @@
                     <w:jc w:val="center"/>
                   </w:pPr>
                   <w:r>
-                    <w:t xml:space="preserve">All NA’s</w:t>
+                    <w:t xml:space="preserve">17361 (90.6%)</w:t>
+                  </w:r>
+                  <w:r>
+                    <w:br/>
+                  </w:r>
+                  <w:r>
+                    <w:t xml:space="preserve">1808 ( 9.4%)</w:t>
                   </w:r>
                 </w:p>
               </w:tc>
@@ -3734,13 +3806,13 @@
                     <w:jc w:val="center"/>
                   </w:pPr>
                   <w:r>
-                    <w:t xml:space="preserve">0</w:t>
+                    <w:t xml:space="preserve">19169</w:t>
                   </w:r>
                   <w:r>
                     <w:br/>
                   </w:r>
                   <w:r>
-                    <w:t xml:space="preserve">(0.0%)</w:t>
+                    <w:t xml:space="preserve">(100.0%)</w:t>
                   </w:r>
                 </w:p>
               </w:tc>
@@ -4292,7 +4364,7 @@
       </w:tr>
     </w:tbl>
     <w:bookmarkEnd w:id="25"/>
-    <w:bookmarkStart w:id="26" w:name="methods"/>
+    <w:bookmarkStart w:id="27" w:name="methods"/>
     <w:p>
       <w:pPr>
         <w:pStyle w:val="Heading2"/>
@@ -4306,41 +4378,21 @@
         <w:pStyle w:val="FirstParagraph"/>
       </w:pPr>
       <w:r>
-        <w:t xml:space="preserve">Multilevel ordinal logistic regression models with individuals nested in countries are used to examine the relationship between labour market position, the perception of technological risk or benefit, the deservingness of others and the perception of redistributive justice across different national contexts. This approach makes it possible to account for the hierarchical structure of the comparative data and to decompose the variance of the outcome between individual factors and country characteristics</w:t>
-      </w:r>
-      <w:r>
-        <w:t xml:space="preserve"> </w:t>
-      </w:r>
-      <w:r>
-        <w:t xml:space="preserve">(</w:t>
-      </w:r>
-      <w:hyperlink w:anchor="ref-hox_multilevel_2017">
-        <w:r>
-          <w:rPr>
-            <w:rStyle w:val="Hyperlink"/>
-          </w:rPr>
-          <w:t xml:space="preserve">Hox et al., 2017</w:t>
+        <w:t xml:space="preserve">The hypotheses were pre-registered on the Open Science Framework (anonymised view-only</w:t>
+      </w:r>
+      <w:r>
+        <w:t xml:space="preserve"> </w:t>
+      </w:r>
+      <w:hyperlink r:id="rId26">
+        <w:r>
+          <w:rPr>
+            <w:rStyle w:val="Hyperlink"/>
+          </w:rPr>
+          <w:t xml:space="preserve">link</w:t>
         </w:r>
       </w:hyperlink>
       <w:r>
-        <w:t xml:space="preserve">;</w:t>
-      </w:r>
-      <w:r>
-        <w:t xml:space="preserve"> </w:t>
-      </w:r>
-      <w:hyperlink w:anchor="ref-snijders_multilevel_2012">
-        <w:r>
-          <w:rPr>
-            <w:rStyle w:val="Hyperlink"/>
-          </w:rPr>
-          <w:t xml:space="preserve">Snijders and Bosker, 2012</w:t>
-        </w:r>
-      </w:hyperlink>
-      <w:r>
-        <w:t xml:space="preserve">)</w:t>
-      </w:r>
-      <w:r>
-        <w:t xml:space="preserve">. Random intercepts are estimated for each country to control heterogeneity at the macro level. The models are estimated sequentially: a model including if the workers are self-employed or platform-worker (Model 1), a second model adding job insecurity (Model 2), a third model incorporating the perception of technological risk and benefit (Model 3), a fourth model adding the perception of the deservingness of others (Model 4), a fifth model incorporating the type of welfare regime (Model 5), and a sixt model adding the control variables (Model 6).</w:t>
+        <w:t xml:space="preserve">). Statistical analyses were conducted in R version 4.3.2.</w:t>
       </w:r>
     </w:p>
     <w:p>
@@ -4348,12 +4400,54 @@
         <w:pStyle w:val="BodyText"/>
       </w:pPr>
       <w:r>
-        <w:t xml:space="preserve">In a seven model, interaction terms between the labour market predictors are introduced (Model 7). In the next models, the type of welfare regime are introduced to test the rest of moderation hypotheses (Models 8 to models 12). All the analyses use the individual survey weights provided by the OECD, and standard errors are clustered by country. The models are estimated with the clmm function of the ordinal package in R.</w:t>
+        <w:t xml:space="preserve">Multilevel ordinal logistic regression models with individuals nested in countries are used to examine the relationship between labour market position, the perception of technological risk or benefit, the deservingness of others and perceived redistributive justice. This approach accounts for the hierarchical structure of the comparative data and decomposes the variance of the outcome between individual and country characteristics</w:t>
+      </w:r>
+      <w:r>
+        <w:t xml:space="preserve"> </w:t>
+      </w:r>
+      <w:r>
+        <w:t xml:space="preserve">(</w:t>
+      </w:r>
+      <w:hyperlink w:anchor="ref-hox_multilevel_2017">
+        <w:r>
+          <w:rPr>
+            <w:rStyle w:val="Hyperlink"/>
+          </w:rPr>
+          <w:t xml:space="preserve">Hox et al., 2017</w:t>
+        </w:r>
+      </w:hyperlink>
+      <w:r>
+        <w:t xml:space="preserve">;</w:t>
+      </w:r>
+      <w:r>
+        <w:t xml:space="preserve"> </w:t>
+      </w:r>
+      <w:hyperlink w:anchor="ref-snijders_multilevel_2012">
+        <w:r>
+          <w:rPr>
+            <w:rStyle w:val="Hyperlink"/>
+          </w:rPr>
+          <w:t xml:space="preserve">Snijders and Bosker, 2012</w:t>
+        </w:r>
+      </w:hyperlink>
+      <w:r>
+        <w:t xml:space="preserve">)</w:t>
+      </w:r>
+      <w:r>
+        <w:t xml:space="preserve">, with random intercepts estimated for each country. The models are estimated sequentially: type of employment (Model 1), adding job insecurity (Model 2), the perceptions of technological risk and benefit (Model 3), the perceived deservingness of others (Model 4), the type of welfare regime (Model 5) and the control variables (Model 6).</w:t>
       </w:r>
     </w:p>
-    <w:bookmarkEnd w:id="26"/>
+    <w:p>
+      <w:pPr>
+        <w:pStyle w:val="BodyText"/>
+      </w:pPr>
+      <w:r>
+        <w:t xml:space="preserve">Model 7 introduces interaction terms between the labour market predictors, and Models 8 to 12 add interactions with the type of welfare regime to test the moderation hypotheses. All the analyses use the individual survey weights provided by the OECD. The models are estimated with the clmm function of the ordinal package in R.</w:t>
+      </w:r>
+    </w:p>
     <w:bookmarkEnd w:id="27"/>
-    <w:bookmarkStart w:id="40" w:name="analysis"/>
+    <w:bookmarkEnd w:id="28"/>
+    <w:bookmarkStart w:id="41" w:name="analysis"/>
     <w:p>
       <w:pPr>
         <w:pStyle w:val="Heading1"/>
@@ -4386,7 +4480,7 @@
         <w:t xml:space="preserve"> </w:t>
       </w:r>
       <w:r>
-        <w:t xml:space="preserve">presents a correlation matrix of the main variables analyzed. In this matrix, the correlations vary between low and moderate negative and positive values. The main correlation effects are between perceived redistributive justice and being a platform worker (r=0,32, p&lt;0.001), the perceived technological displacement (r=0,24, p&lt;0,001), the skill obsolescence risk (r=0,26, p&lt;0,001), and the perceived technological benefit (r=0,21, p&lt;0,001) which are positive and moderated effects. In other sence, the deservingess of others has a negative and moderated effect (r=0,16, p&lt;0,01).</w:t>
+        <w:t xml:space="preserve">presents the correlation matrix of the main variables, with coefficients ranging from low to moderate. The strongest associations of perceived redistributive justice are with being a platform worker (r = 0.32, p &lt; 0.001), technological displacement (r = 0.24, p &lt; 0.001), skill obsolescence risk (r = 0.26, p &lt; 0.001) and perceived technological benefit (r = 0.21, p &lt; 0.001), all of them positive and moderate. Deservingness of others, in contrast, shows a negative association (r = −0.16, p &lt; 0.01).</w:t>
       </w:r>
     </w:p>
     <w:p>
@@ -4394,7 +4488,7 @@
         <w:pStyle w:val="BodyText"/>
       </w:pPr>
       <w:r>
-        <w:t xml:space="preserve">Regarding the independent variables, the main correlation effects are between the corcern about job and income loss and being a platform worker (r=0,15, p&lt;0,001), and with the perceived of technological change variables. Between this this three last variables, the correlations effects are positive and significant, contrary to the initial intuitions.</w:t>
+        <w:t xml:space="preserve">Among the independent variables, concern about job and income loss correlates with being a platform worker (r = 0.15, p &lt; 0.001) and with the technological perception variables (r = 0.18; r = 0.3). The correlations among these three technological variables are themselves positive and significant (r = 0.42; r = 0.49), and the strongest of them, between technological displacement and perceived benefit (r = 0.72), runs contrary to the initial intuition that risk and benefit perceptions would be negatively related.</w:t>
       </w:r>
     </w:p>
     <w:tbl>
@@ -4410,7 +4504,7 @@
       <w:tr>
         <w:tc>
           <w:tcPr/>
-          <w:bookmarkStart w:id="31" w:name="fig-correlation"/>
+          <w:bookmarkStart w:id="32" w:name="fig-correlation"/>
           <w:p>
             <w:pPr>
               <w:jc w:val="center"/>
@@ -4434,18 +4528,18 @@
                 <wp:inline>
                   <wp:extent cx="4533900" cy="4533900"/>
                   <wp:effectExtent b="0" l="0" r="0" t="0"/>
-                  <wp:docPr descr="" title="" id="29" name="Picture"/>
+                  <wp:docPr descr="" title="" id="30" name="Picture"/>
                   <a:graphic>
                     <a:graphicData uri="http://schemas.openxmlformats.org/drawingml/2006/picture">
                       <pic:pic>
                         <pic:nvPicPr>
-                          <pic:cNvPr descr="output/figures/corrplot.png" id="30" name="Picture"/>
+                          <pic:cNvPr descr="output/figures/corrplot.png" id="31" name="Picture"/>
                           <pic:cNvPicPr>
                             <a:picLocks noChangeArrowheads="1" noChangeAspect="1"/>
                           </pic:cNvPicPr>
                         </pic:nvPicPr>
                         <pic:blipFill>
-                          <a:blip r:embed="rId28"/>
+                          <a:blip r:embed="rId29"/>
                           <a:stretch>
                             <a:fillRect/>
                           </a:stretch>
@@ -4472,11 +4566,11 @@
               </w:drawing>
             </w:r>
           </w:p>
-          <w:bookmarkEnd w:id="31"/>
+          <w:bookmarkEnd w:id="32"/>
         </w:tc>
       </w:tr>
     </w:tbl>
-    <w:bookmarkStart w:id="39" w:name="X2e6e994f6d6231464fb4cf63b4efb51841123d7"/>
+    <w:bookmarkStart w:id="40" w:name="X2e6e994f6d6231464fb4cf63b4efb51841123d7"/>
     <w:p>
       <w:pPr>
         <w:pStyle w:val="Heading2"/>
@@ -4498,7 +4592,7 @@
       <w:tr>
         <w:tc>
           <w:tcPr/>
-          <w:bookmarkStart w:id="32" w:name="tbl-modelos"/>
+          <w:bookmarkStart w:id="33" w:name="tbl-modelos"/>
           <w:p>
             <w:pPr>
               <w:jc w:val="center"/>
@@ -4509,7 +4603,7 @@
               <w:pStyle w:val="ImageCaption"/>
             </w:pPr>
             <w:r>
-              <w:t xml:space="preserve">Table 2: Multilevel models for retributive preferences</w:t>
+              <w:t xml:space="preserve">Table 2: Multilevel models for perceived redistributive justice</w:t>
             </w:r>
           </w:p>
           <w:tbl xmlns:w="http://schemas.openxmlformats.org/wordprocessingml/2006/main" xmlns:r="http://schemas.openxmlformats.org/officeDocument/2006/relationships" xmlns:w14="http://schemas.microsoft.com/office/word/2010/wordml" xmlns:wp="http://schemas.openxmlformats.org/drawingml/2006/wordprocessingDrawing" xmlns:a="http://schemas.openxmlformats.org/drawingml/2006/main" xmlns:pic="http://schemas.openxmlformats.org/drawingml/2006/picture">
@@ -4887,7 +4981,7 @@
                       <w:szCs w:val="16"/>
                       <w:color w:val="000000"/>
                     </w:rPr>
-                    <w:t xml:space="preserve">self-employed worker (ref. No)</w:t>
+                    <w:t xml:space="preserve">Self-employed worker (ref. No)</w:t>
                   </w:r>
                 </w:p>
               </w:tc>
@@ -12110,13 +12204,13 @@
                       <w:szCs w:val="14"/>
                       <w:color w:val="000000"/>
                     </w:rPr>
-                    <w:t xml:space="preserve">Note: Cells contain regression coefficients with standard errors in parentheses. * p &lt; 0.05; ** p &lt; 0.01; *** p &lt; 0.001. Model 6 is controlled by sex, age and income with significant effects and education with no significant effect.</w:t>
+                    <w:t xml:space="preserve">Note: Cells contain regression coefficients with standard errors in parentheses. * p &lt; 0.05; ** p &lt; 0.01; *** p &lt; 0.001. Model 6 controls for sex, age, education and income; sex, age and income show significant effects, education does not.</w:t>
                   </w:r>
                 </w:p>
               </w:tc>
             </w:tr>
           </w:tbl>
-          <w:bookmarkEnd w:id="32"/>
+          <w:bookmarkEnd w:id="33"/>
         </w:tc>
       </w:tr>
     </w:tbl>
@@ -12125,7 +12219,7 @@
         <w:pStyle w:val="BodyText"/>
       </w:pPr>
       <w:r>
-        <w:t xml:space="preserve">Cumulative-link mixed models were fitted for perceived redistributive justice, with a random intercept for country. Note that ordinal package reports the number of observations as the sum of the sampling weights rather than the count of cases</w:t>
+        <w:t xml:space="preserve">Cumulative-link mixed models were fitted for perceived redistributive justice, with a random intercept for country. Note that the ordinal package reports the number of observations as the sum of the sampling weights rather than the count of cases</w:t>
       </w:r>
       <w:r>
         <w:t xml:space="preserve"> </w:t>
@@ -12164,7 +12258,7 @@
         <w:t xml:space="preserve"> </w:t>
       </w:r>
       <w:r>
-        <w:t xml:space="preserve">follows a block-building logic — employment status (Model 1), economic insecurity (Model 2), the technological-perception battery (Model 3), deservingness of others (Model 4) and welfare regime (Model 5) — with sociodemographic controls (sex, age, income and education) entered only in Model 6. Across the sequence the country-level variance declines from 0.235 to 0.193 and the BIC from 50,264.9 to 48,616.2, indicating improved fit as substantive predictors are added.</w:t>
+        <w:t xml:space="preserve">follows a block-building logic — type of employment (Model 1), concern about job and income loss (Model 2), the technological-perception battery (Model 3), deservingness of others (Model 4) and welfare regime (Model 5) — with sociodemographic controls (sex, age, income and education) entered only in Model 6. Between the first and the final model the country-level variance declines from 0.235 to 0.193 and the BIC from 50,264.9 to 48,616.2.</w:t>
       </w:r>
     </w:p>
     <w:p>
@@ -12196,7 +12290,7 @@
       <w:tr>
         <w:tc>
           <w:tcPr/>
-          <w:bookmarkStart w:id="33" w:name="tbl-interact"/>
+          <w:bookmarkStart w:id="34" w:name="tbl-interact"/>
           <w:p>
             <w:pPr>
               <w:jc w:val="center"/>
@@ -12207,7 +12301,7 @@
               <w:pStyle w:val="ImageCaption"/>
             </w:pPr>
             <w:r>
-              <w:t xml:space="preserve">Table 3: Interaction multilevel models for retributive preferences</w:t>
+              <w:t xml:space="preserve">Table 3: Multilevel interaction models for perceived redistributive justice</w:t>
             </w:r>
           </w:p>
           <w:tbl xmlns:w="http://schemas.openxmlformats.org/wordprocessingml/2006/main" xmlns:r="http://schemas.openxmlformats.org/officeDocument/2006/relationships" xmlns:w14="http://schemas.microsoft.com/office/word/2010/wordml" xmlns:wp="http://schemas.openxmlformats.org/drawingml/2006/wordprocessingDrawing" xmlns:a="http://schemas.openxmlformats.org/drawingml/2006/main" xmlns:pic="http://schemas.openxmlformats.org/drawingml/2006/picture">
@@ -25146,13 +25240,13 @@
                       <w:szCs w:val="14"/>
                       <w:color w:val="000000"/>
                     </w:rPr>
-                    <w:t xml:space="preserve">Note: Cells contain regression coefficients with standard errors in parentheses. * p &lt; 0.05; ** p &lt; 0.01; *** p &lt; 0.001. All models are controlled by sex, age and income with significant effects and education with no significant effect.</w:t>
+                    <w:t xml:space="preserve">Note: Cells contain regression coefficients with standard errors in parentheses. * p &lt; 0.05; ** p &lt; 0.01; *** p &lt; 0.001. All models control for sex, age, education and income; sex, age and income show significant effects, education does not.</w:t>
                   </w:r>
                 </w:p>
               </w:tc>
             </w:tr>
           </w:tbl>
-          <w:bookmarkEnd w:id="33"/>
+          <w:bookmarkEnd w:id="34"/>
         </w:tc>
       </w:tr>
     </w:tbl>
@@ -25172,7 +25266,7 @@
         <w:t xml:space="preserve"> </w:t>
       </w:r>
       <w:r>
-        <w:t xml:space="preserve">takes the fully adjusted specification and introduces one interaction at a time: self-employed × platform (Model 7), followed by the cross-level products of welfare regime with self-employment (Model 8), platform work (Model 9), economic insecurity (Model 10), technological displacement (Model 11) and deservingness (Model 12). The BIC is narrow across these models (48,612.2–48,626.8) and the country variance stable (≈ 0.19). The four regime moderations are displayed in</w:t>
+        <w:t xml:space="preserve">takes the fully adjusted specification and introduces one interaction at a time: self-employed × platform (Model 7), followed by the cross-level products of welfare regime with self-employment (Model 8), platform work (Model 9), concern about job and income loss (Model 10), technological displacement (Model 11) and deservingness (Model 12). The BIC varies little across these models (48,612.2–48,626.8) and the country variance is stable (≈ 0.19). The four regime moderations are displayed in</w:t>
       </w:r>
       <w:r>
         <w:t xml:space="preserve"> </w:t>
@@ -25186,7 +25280,7 @@
         </w:r>
       </w:hyperlink>
       <w:r>
-        <w:t xml:space="preserve">; because emmeans R package</w:t>
+        <w:t xml:space="preserve">; because the emmeans package</w:t>
       </w:r>
       <w:r>
         <w:t xml:space="preserve"> </w:t>
@@ -25242,7 +25336,7 @@
         <w:pStyle w:val="BodyText"/>
       </w:pPr>
       <w:r>
-        <w:t xml:space="preserve">The same dampening governs the remaining predictors. Technological displacement is positive in every regime (bottom left) but significantly attenuated relative to liberal regimes (× social-democratic = −0.214; × conservative = −0.138; both p &lt; 0.001). Deservingness is negative throughout (bottom right), with the steepest slope in conservative regimes (× conservative = −0.090, p &lt; 0.01) and a non-significant social-democratic interaction. Economic insecurity interacts significantly only with the conservative contrast (−0.120, p &lt; 0.001). Once these interactions are specified, the social-democratic main effect becomes significant in the displacement and deservingness models (0.843, p &lt; 0.01; 0.638, p &lt; 0.05), where it was null in</w:t>
+        <w:t xml:space="preserve">The remaining interaction terms are also negative. Technological displacement is positive in every regime (bottom left) but significantly attenuated relative to liberal regimes (× social-democratic = −0.214; × conservative = −0.138; both p &lt; 0.001). Deservingness is negative throughout (bottom right), and here the negative interaction implies amplification rather than attenuation: the slope is steepest in conservative regimes (× conservative = −0.090, p &lt; 0.01), with a non-significant social-democratic term. Concern about job and income loss interacts significantly only with the conservative contrast (−0.120, p &lt; 0.001). Once these interactions are specified, the social-democratic main effect becomes significant in the displacement and deservingness models (0.843, p &lt; 0.01; 0.638, p &lt; 0.05), where it was null in</w:t>
       </w:r>
       <w:r>
         <w:t xml:space="preserve"> </w:t>
@@ -25264,7 +25358,7 @@
         <w:pStyle w:val="BodyText"/>
       </w:pPr>
       <w:r>
-        <w:t xml:space="preserve">A consistent pattern emerges: across all four panels the social-democratic line is the flattest, and every regime interaction with an individual-level predictor is negative. Substantively, perceptions of redistributive justice in social-democratic regimes appear less responsive to individual labour-market position and technological perceptions than under liberal arrangements, consistent with the view that encompassing welfare institutions decouple distributive attitudes from individual exposure.</w:t>
+        <w:t xml:space="preserve">A consistent pattern emerges: every regime interaction with an individual-level predictor is negative, so each association is weaker —or more adverse— than under liberal arrangements. For platform work and technological displacement this translates into visibly flatter slopes in social-democratic regimes, consistent with the view that encompassing welfare institutions partially decouple distributive attitudes from individual technological exposure. The exceptions to this dampening logic are self-employment, which becomes consequential —and negative— only under social-democratic arrangements, and deservingness, whose negative gradient is steepest in conservative regimes.</w:t>
       </w:r>
     </w:p>
     <w:tbl>
@@ -25280,7 +25374,7 @@
       <w:tr>
         <w:tc>
           <w:tcPr/>
-          <w:bookmarkStart w:id="38" w:name="fig-interact"/>
+          <w:bookmarkStart w:id="39" w:name="fig-interact"/>
           <w:p>
             <w:pPr>
               <w:jc w:val="center"/>
@@ -25307,7 +25401,7 @@
             <w:tr>
               <w:tc>
                 <w:tcPr/>
-                <w:bookmarkStart w:id="37" w:name="fig-interact"/>
+                <w:bookmarkStart w:id="38" w:name="fig-interact"/>
                 <w:p>
                   <w:pPr>
                     <w:pStyle w:val="Compact"/>
@@ -25319,18 +25413,18 @@
                       <wp:inline>
                         <wp:extent cx="4533900" cy="2418079"/>
                         <wp:effectExtent b="0" l="0" r="0" t="0"/>
-                        <wp:docPr descr="" title="" id="35" name="Picture"/>
+                        <wp:docPr descr="" title="" id="36" name="Picture"/>
                         <a:graphic>
                           <a:graphicData uri="http://schemas.openxmlformats.org/drawingml/2006/picture">
                             <pic:pic>
                               <pic:nvPicPr>
-                                <pic:cNvPr descr="paper_files/figure-docx/fig-interact-1.png" id="36" name="Picture"/>
+                                <pic:cNvPr descr="paper_files/figure-docx/fig-interact-1.png" id="37" name="Picture"/>
                                 <pic:cNvPicPr>
                                   <a:picLocks noChangeArrowheads="1" noChangeAspect="1"/>
                                 </pic:cNvPicPr>
                               </pic:nvPicPr>
                               <pic:blipFill>
-                                <a:blip r:embed="rId34"/>
+                                <a:blip r:embed="rId35"/>
                                 <a:stretch>
                                   <a:fillRect/>
                                 </a:stretch>
@@ -25371,18 +25465,18 @@
                     <w:t xml:space="preserve">(a) Source: own elaboration with data from the OECD, Risks That Matter survey 2024.</w:t>
                   </w:r>
                 </w:p>
-                <w:bookmarkEnd w:id="37"/>
+                <w:bookmarkEnd w:id="38"/>
               </w:tc>
             </w:tr>
           </w:tbl>
-          <w:bookmarkEnd w:id="38"/>
+          <w:bookmarkEnd w:id="39"/>
           <w:p/>
         </w:tc>
       </w:tr>
     </w:tbl>
-    <w:bookmarkEnd w:id="39"/>
     <w:bookmarkEnd w:id="40"/>
-    <w:bookmarkStart w:id="41" w:name="discussion"/>
+    <w:bookmarkEnd w:id="41"/>
+    <w:bookmarkStart w:id="42" w:name="discussion"/>
     <w:p>
       <w:pPr>
         <w:pStyle w:val="Heading1"/>
@@ -25404,7 +25498,7 @@
         <w:pStyle w:val="BodyText"/>
       </w:pPr>
       <w:r>
-        <w:t xml:space="preserve">This article asked whether the perceived justice of the fiscal exchange between citizens and the state is anchored in labour-market position and in how workers anticipate technological change, and whether welfare institutions condition that relationship. The results lend qualified support to the reciprocity framework that motivated the analysis, but their main interest lies where they depart from the risk-and-redistribution tradition from which the hypotheses were drawn. Three individual-level expectations held: perceived job insecurity and the perception that others receive undeserved benefits both depressed perceived redistributive justice (H2, H5), while perceiving technology as enabling raised it (H4) and was the strongest individual predictor. Two did not: non-standard employment was not associated with lower perceived redistributive justice, and platform workers reported it more strongly (H1); and perceived technological displacement risk, expected to erode justice, instead increased it (H3). The moderation analyses, finally, disclosed an institutional patterning that the null average differences between regimes had obscured.</w:t>
+        <w:t xml:space="preserve">This article asked whether the perceived justice of the fiscal exchange between citizens and the state is anchored in labour-market position and in how workers anticipate technological change, and whether welfare institutions condition that relationship. The results lend qualified support to the reciprocity framework that motivated the analysis, but their main interest lies where they depart from the risk-and-redistribution tradition from which the hypotheses were drawn. Three individual-level expectations held: perceived job insecurity and the perception that others receive undeserved benefits both depressed perceived redistributive justice (H2, H5), while perceiving technology as enabling raised it (H4), the largest effect among the technological perceptions. Two did not: non-standard employment was not associated with lower perceived redistributive justice, and platform workers reported it more strongly (H1); and perceived technological displacement risk, expected to erode justice, instead increased it (H3). The moderation analyses, finally, disclosed an institutional patterning that the null average differences between regimes had obscured.</w:t>
       </w:r>
     </w:p>
     <w:p>
@@ -25412,7 +25506,7 @@
         <w:pStyle w:val="BodyText"/>
       </w:pPr>
       <w:r>
-        <w:t xml:space="preserve">The confirmed hypotheses support the moral-economy reading on which the study rests. Workers who anticipate losing their job or income within the year judge the exchange as less just (H2), and those who perceive others as drawing unearned benefits extend that judgement to their own relationship with the system (H5), consistent with the view that lateral deservingness assessments and self-referential justice belong to a single moral economy of welfare</w:t>
+        <w:t xml:space="preserve">The confirmed hypotheses support the moral-economy reading on which the study rests. Workers concerned about losing their job or income over the coming year or two judge the exchange as less just (H2), and those who perceive others as drawing unearned benefits extend that judgement to their own relationship with the system (H5), consistent with the view that lateral deservingness assessments and self-referential justice belong to a single moral economy of welfare</w:t>
       </w:r>
       <w:r>
         <w:t xml:space="preserve"> </w:t>
@@ -25488,7 +25582,7 @@
         <w:pStyle w:val="BodyText"/>
       </w:pPr>
       <w:r>
-        <w:t xml:space="preserve">Self-employment was unrelated to perceived redistributive justice throughout, which is unsurprising given a category ranging from established professionals to precarious own-account workers whose contrasting ties to the protection system plausibly offset one another. The reversal for platform work — roughly twice the odds of higher perceived justce (OR ≈ 2.2) — admits two readings. Compositionally, self-reported platform work in OECD samples is heterogeneous, capturing supplementary and intermittent earners alongside the platform-dependent</w:t>
+        <w:t xml:space="preserve">Self-employment was unrelated to perceived redistributive justice throughout, which is unsurprising given a category ranging from established professionals to precarious own-account workers whose contrasting ties to the protection system plausibly offset one another. The reversal for platform work — roughly twice the odds of higher perceived justice (OR ≈ 2.2) — admits two readings. Compositionally, self-reported platform work in OECD samples is heterogeneous, capturing supplementary and intermittent earners alongside the platform-dependent</w:t>
       </w:r>
       <w:r>
         <w:t xml:space="preserve"> </w:t>
@@ -25649,7 +25743,7 @@
         <w:pStyle w:val="BodyText"/>
       </w:pPr>
       <w:r>
-        <w:t xml:space="preserve">The moderation evidence favours this reading. Were the positive coefficient produced by institutional reassurance, it should be largest where protection is most encompassing; instead it is steepest in liberal regimes and significantly attenuated in social-democratic and conservative ones (H8). A temporal contrast reinforces the point: the displacement battery is prospective and abstract, asking about a five-year horizon, whereas the job-insecurity item that behaves as predicted (H2) concerns concrete income loss within twelve months. Near-term, tangible insecurity erodes justice; distant technological prognostication does not, and may instead index a reflective engagement with the future of work bound up with other favourable dispositions</w:t>
+        <w:t xml:space="preserve">The moderation evidence favours this reading. Were the positive coefficient produced by institutional reassurance, it should be largest where protection is most encompassing; instead it is steepest in liberal regimes and significantly attenuated in social-democratic and conservative ones (H8). A temporal contrast reinforces the point: the displacement battery is prospective and abstract, asking about a five-year horizon, whereas the job-insecurity item that behaves as predicted (H2) concerns concrete income loss over the next year or two. Near-term, tangible insecurity erodes justice; distant technological prognostication does not, and may instead index a reflective engagement with the future of work bound up with other favourable dispositions</w:t>
       </w:r>
       <w:r>
         <w:t xml:space="preserve"> </w:t>
@@ -25683,7 +25777,7 @@
         <w:t xml:space="preserve">)</w:t>
       </w:r>
       <w:r>
-        <w:t xml:space="preserve">. A measurement caveat sharpens rather than dissolves this: displacement and benefit are positively correlated with each other and with the outcome, and although the factor analysis separates them, the shared sign suggests a common component of engagement with the technological frame, which future instrumentation should separate from valence.</w:t>
+        <w:t xml:space="preserve">. A measurement caveat sharpens rather than dissolves this: displacement and benefit are positively correlated with each other (r = 0.72) and with the outcome, and although the factor analysis separates them, the shared sign suggests a common component of engagement with the technological frame, which future instrumentation should separate from valence.</w:t>
       </w:r>
     </w:p>
     <w:p>
@@ -25742,7 +25836,7 @@
         <w:t xml:space="preserve">)</w:t>
       </w:r>
       <w:r>
-        <w:t xml:space="preserve">. Across all four moderation panels the social-democratic slope is the flattest and every regime interaction is negative: the employment effect is confined to social-democratic regimes (H7), the displacement effect is dampened in both non-liberal regimes (H8), and the deservingness effect is steepest in conservative regimes and indistinguishable between liberal and social-democratic ones (H9), only partly matching the universalist–residual expectation. The unifying reading is that universalist institutions decouple perceived redistributive justice from individual labour-market exposure, whereas residual, market-tied arrangements bind the two together</w:t>
+        <w:t xml:space="preserve">. Every regime interaction is negative, though the pattern only partly matches the universalist–residual expectation: the positive association of platform work is steepest under liberal arrangements and flattest under social-democratic ones, whereas the self-employment effect, predicted to be strongest in residual regimes, emerges only under social-democratic arrangements (H7); the displacement effect is dampened in both non-liberal regimes (H8); and the deservingness effect is steepest in conservative regimes and indistinguishable between liberal and social-democratic ones (H9). For platform work and the technological perceptions, the reading is that universalist institutions decouple perceived redistributive justice from individual labour-market exposure, whereas residual, market-tied arrangements bind the two together</w:t>
       </w:r>
       <w:r>
         <w:t xml:space="preserve"> </w:t>
@@ -25776,6 +25870,26 @@
         <w:t xml:space="preserve">)</w:t>
       </w:r>
       <w:r>
+        <w:t xml:space="preserve">. The self-employment exception is consistent with the same reciprocity logic once institutional distance is understood in relative terms: where dependent employment is most generously covered, own-account workers stand furthest from the prevailing standard of protection, and their exchange with the state reads as comparatively less just</w:t>
+      </w:r>
+      <w:r>
+        <w:t xml:space="preserve"> </w:t>
+      </w:r>
+      <w:r>
+        <w:t xml:space="preserve">(</w:t>
+      </w:r>
+      <w:hyperlink w:anchor="ref-schwander_who_2013">
+        <w:r>
+          <w:rPr>
+            <w:rStyle w:val="Hyperlink"/>
+          </w:rPr>
+          <w:t xml:space="preserve">Schwander and Häusermann, 2013</w:t>
+        </w:r>
+      </w:hyperlink>
+      <w:r>
+        <w:t xml:space="preserve">)</w:t>
+      </w:r>
+      <w:r>
         <w:t xml:space="preserve">. This refines the institutional-logic tradition: regimes act less by raising the level of satisfaction than by governing how far it fragments along individual lines, a dynamic especially salient in highly commodified contexts such as the Chilean one</w:t>
       </w:r>
       <w:r>
@@ -25813,8 +25927,8 @@
         <w:t xml:space="preserve">.</w:t>
       </w:r>
     </w:p>
-    <w:bookmarkEnd w:id="41"/>
-    <w:bookmarkStart w:id="42" w:name="conclusion"/>
+    <w:bookmarkEnd w:id="42"/>
+    <w:bookmarkStart w:id="43" w:name="conclusion"/>
     <w:p>
       <w:pPr>
         <w:pStyle w:val="Heading1"/>
@@ -25834,7 +25948,7 @@
         <w:t xml:space="preserve"> </w:t>
       </w:r>
       <w:r>
-        <w:t xml:space="preserve">Drawing on the 2024 wave of the OECD Risks That Matter survey across 27 countries, this article has shown that the perceived redistributive justice of the fiscal exchange with the welfare state is anchored in the experience of work, though not in the manner the risk-and-redistribution tradition would predict. Concrete employment insecurity and the perception that others receive undeserved benefits erode perceived justice, and perceiving technology as enabling enhances it; but non-standard employment does not depress justice (platform workers report it more strongly) and perceived technological displacement risk raises rather than lowers it. Above all, universalist welfare institutions appear to decouple perceived redistributive justice from individual labour-market position and technological perception, while residual arrangements tie them tightly together.</w:t>
+        <w:t xml:space="preserve">Drawing on the 2024 wave of the OECD Risks That Matter survey across 27 countries, this article has shown that the perceived redistributive justice of the fiscal exchange with the welfare state is anchored in the experience of work, though not in the manner the risk-and-redistribution tradition would predict. Concrete employment insecurity and the perception that others receive undeserved benefits erode perceived justice, and perceiving technology as enabling enhances it; but non-standard employment does not depress justice (platform workers report it more strongly) and perceived technological displacement risk raises rather than lowers it. Above all, universalist welfare institutions appear to decouple perceived redistributive justice from platform work and technological perception, while residual arrangements tie them tightly together; self-employment, by contrast, becomes consequential precisely under universalist arrangements.</w:t>
       </w:r>
     </w:p>
     <w:p>
@@ -25842,7 +25956,7 @@
         <w:pStyle w:val="BodyText"/>
       </w:pPr>
       <w:r>
-        <w:t xml:space="preserve">Two implications for the sociology of welfare attitudes follow. First, perceptions and preferences must be kept analytically apart: the same exposure that raises the demand for redistribution may leave the evaluation of one’s own exchange unchanged or even more favourable, so findings established for one attitudinal object cannot be transposed to the other</w:t>
+        <w:t xml:space="preserve">Two implications for the comparative study of welfare attitudes follow. First, perceptions and preferences must be kept analytically apart: the same exposure that raises the demand for redistribution may leave the evaluation of one’s own exchange unchanged or even more favourable, so findings established for one attitudinal object cannot be transposed to the other</w:t>
       </w:r>
       <w:r>
         <w:t xml:space="preserve"> </w:t>
@@ -25870,13 +25984,7 @@
         <w:pStyle w:val="BodyText"/>
       </w:pPr>
       <w:r>
-        <w:t xml:space="preserve">These conclusions are bounded by the design. The data are cross-sectional, so the analysis identifies associations rather than causal effects, and reverse causation is plausible: those who already</w:t>
-      </w:r>
-      <w:r>
-        <w:t xml:space="preserve"> </w:t>
-      </w:r>
-      <w:r>
-        <w:t xml:space="preserve">regard their exchange with the state as just may evaluate technological change more benignly, rather than the reverse. The principal independent variables of theoretical interest rest on single items or short scales, and the platform and self-employment categories are internally heterogeneous, conflating distinct relationships with the protection system under a common label</w:t>
+        <w:t xml:space="preserve">The findings also bear on the European policy agenda on access to social protection</w:t>
       </w:r>
       <w:r>
         <w:t xml:space="preserve"> </w:t>
@@ -25884,53 +25992,33 @@
       <w:r>
         <w:t xml:space="preserve">(</w:t>
       </w:r>
-      <w:hyperlink w:anchor="ref-vallas_what_2020">
-        <w:r>
-          <w:rPr>
-            <w:rStyle w:val="Hyperlink"/>
-          </w:rPr>
-          <w:t xml:space="preserve">Vallas and Schor, 2020</w:t>
+      <w:hyperlink w:anchor="X8f09c96f00ce2967a1485d0ccd3bfdbc82ad32c">
+        <w:r>
+          <w:rPr>
+            <w:rStyle w:val="Hyperlink"/>
+          </w:rPr>
+          <w:t xml:space="preserve">Council of the European Union, 2019</w:t>
         </w:r>
       </w:hyperlink>
       <w:r>
+        <w:t xml:space="preserve">;</w:t>
+      </w:r>
+      <w:r>
+        <w:t xml:space="preserve"> </w:t>
+      </w:r>
+      <w:hyperlink w:anchor="X84184924b7d64ffb4d0b8e850c04b813ecf2c5f">
+        <w:r>
+          <w:rPr>
+            <w:rStyle w:val="Hyperlink"/>
+          </w:rPr>
+          <w:t xml:space="preserve">European Parliament and Council of the European Union, 2024</w:t>
+        </w:r>
+      </w:hyperlink>
+      <w:r>
         <w:t xml:space="preserve">)</w:t>
       </w:r>
       <w:r>
-        <w:t xml:space="preserve">. The positive manifold among the technological-perception items signals that the battery does not fully separate the valence of a perception from engagement with technological change as a frame. At the macro level, 27 countries afford limited power for cross-level interactions and place a heavy burden on the regime classification, whose treatment of the post-socialist and southern European cases, while defensible, remains contestable</w:t>
-      </w:r>
-      <w:r>
-        <w:t xml:space="preserve"> </w:t>
-      </w:r>
-      <w:r>
-        <w:t xml:space="preserve">(</w:t>
-      </w:r>
-      <w:hyperlink w:anchor="ref-aidukaite_welfare_2011">
-        <w:r>
-          <w:rPr>
-            <w:rStyle w:val="Hyperlink"/>
-          </w:rPr>
-          <w:t xml:space="preserve">Aidukaite, 2011</w:t>
-        </w:r>
-      </w:hyperlink>
-      <w:r>
-        <w:t xml:space="preserve">;</w:t>
-      </w:r>
-      <w:r>
-        <w:t xml:space="preserve"> </w:t>
-      </w:r>
-      <w:hyperlink w:anchor="ref-ferrera_southern_1996">
-        <w:r>
-          <w:rPr>
-            <w:rStyle w:val="Hyperlink"/>
-          </w:rPr>
-          <w:t xml:space="preserve">Ferrera, 1996</w:t>
-        </w:r>
-      </w:hyperlink>
-      <w:r>
-        <w:t xml:space="preserve">)</w:t>
-      </w:r>
-      <w:r>
-        <w:t xml:space="preserve">.</w:t>
+        <w:t xml:space="preserve">. That platform workers judge their exchange with the state as comparatively just should not be read as the absence of a problem: on the proportionality reading advanced here, it reflects how little they contribute to and expect from the contributory system. Extending coverage, the aim of the Council Recommendation and, for platform work, of the recent directive, will draw these workers into a fuller exchange in which more is contributed and more is owed, and the legitimacy returns of that extension will depend on whether the ensuing entitlements are proportionate and legible. The self-employment finding adds a caution for the most encompassing systems: formal inclusion that leaves own-account workers at a visible distance from the employee standard may depress, rather than enhance, their sense of a just exchange.</w:t>
       </w:r>
     </w:p>
     <w:p>
@@ -25938,7 +26026,7 @@
         <w:pStyle w:val="BodyText"/>
       </w:pPr>
       <w:r>
-        <w:t xml:space="preserve">These limitations mark out an agenda. Panel data would allow the temporal ordering of technological perception and perceived redistributive justice to be established and reverse causation to be assessed directly. Instrumentation that separates concrete from prospective technological risk, and the valence of a perception from the salience of technological change, would clarify the mechanisms behind the displacement anomaly; qualitative inquiry into how platform and own-account workers construct the reference points against which they believe that justice would do the same for the platform result. Comparative leverage would be improved by replacing categorical regimes with continuous indicators of decommodification and of active labour-market and social-investment provision, which would also permit a more direct test of whether policy feedback, rather than reassurance, underlies the institutional patterning observed here</w:t>
+        <w:t xml:space="preserve">These conclusions are bounded by the design. The data are cross-sectional, so the analysis identifies associations rather than causal effects, and reverse causation is plausible: those who already regard their exchange with the state as just may evaluate technological change more benignly, rather than the reverse. The principal independent variables of theoretical interest rest on single items or short scales, and the platform and self-employment categories are internally heterogeneous, conflating distinct relationships with the protection system under a common label</w:t>
       </w:r>
       <w:r>
         <w:t xml:space="preserve"> </w:t>
@@ -25946,46 +26034,60 @@
       <w:r>
         <w:t xml:space="preserve">(</w:t>
       </w:r>
-      <w:hyperlink w:anchor="ref-fan_how_2024">
-        <w:r>
-          <w:rPr>
-            <w:rStyle w:val="Hyperlink"/>
-          </w:rPr>
-          <w:t xml:space="preserve">Fan et al., 2024</w:t>
+      <w:hyperlink w:anchor="ref-vallas_what_2020">
+        <w:r>
+          <w:rPr>
+            <w:rStyle w:val="Hyperlink"/>
+          </w:rPr>
+          <w:t xml:space="preserve">Vallas and Schor, 2020</w:t>
         </w:r>
       </w:hyperlink>
       <w:r>
+        <w:t xml:space="preserve">)</w:t>
+      </w:r>
+      <w:r>
+        <w:t xml:space="preserve">. The positive manifold among the technological-perception items signals that the battery does not fully separate the valence of a perception from engagement with technological change as a frame. At the macro level, 27 countries afford limited power for cross-level interactions and place a heavy burden on the regime classification, whose treatment of the post-socialist, southern European and non-European cases, while defensible, remains contestable</w:t>
+      </w:r>
+      <w:r>
+        <w:t xml:space="preserve"> </w:t>
+      </w:r>
+      <w:r>
+        <w:t xml:space="preserve">(</w:t>
+      </w:r>
+      <w:hyperlink w:anchor="ref-aidukaite_welfare_2011">
+        <w:r>
+          <w:rPr>
+            <w:rStyle w:val="Hyperlink"/>
+          </w:rPr>
+          <w:t xml:space="preserve">Aidukaite, 2011</w:t>
+        </w:r>
+      </w:hyperlink>
+      <w:r>
         <w:t xml:space="preserve">;</w:t>
       </w:r>
       <w:r>
         <w:t xml:space="preserve"> </w:t>
       </w:r>
-      <w:hyperlink w:anchor="ref-gallego_automation_2022">
-        <w:r>
-          <w:rPr>
-            <w:rStyle w:val="Hyperlink"/>
-          </w:rPr>
-          <w:t xml:space="preserve">Gallego and Kurer, 2022</w:t>
+      <w:hyperlink w:anchor="ref-ferrera_southern_1996">
+        <w:r>
+          <w:rPr>
+            <w:rStyle w:val="Hyperlink"/>
+          </w:rPr>
+          <w:t xml:space="preserve">Ferrera, 1996</w:t>
         </w:r>
       </w:hyperlink>
       <w:r>
-        <w:t xml:space="preserve">)</w:t>
-      </w:r>
-      <w:r>
-        <w:t xml:space="preserve">. Greater attention to within-regime heterogeneity, particularly in the commodified welfare states of Latin America, would test the generalisability of the decoupling thesis beyond the European core</w:t>
-      </w:r>
-      <w:r>
-        <w:t xml:space="preserve"> </w:t>
-      </w:r>
-      <w:r>
-        <w:t xml:space="preserve">(</w:t>
-      </w:r>
-      <w:hyperlink w:anchor="ref-perez-ahumada_conditioning_2026">
-        <w:r>
-          <w:rPr>
-            <w:rStyle w:val="Hyperlink"/>
-          </w:rPr>
-          <w:t xml:space="preserve">Pérez-Ahumada et al., 2026</w:t>
+        <w:t xml:space="preserve">;</w:t>
+      </w:r>
+      <w:r>
+        <w:t xml:space="preserve"> </w:t>
+      </w:r>
+      <w:hyperlink w:anchor="ref-franzoni_welfare_2008">
+        <w:r>
+          <w:rPr>
+            <w:rStyle w:val="Hyperlink"/>
+          </w:rPr>
+          <w:t xml:space="preserve">Martínez Franzoni, 2008</w:t>
         </w:r>
       </w:hyperlink>
       <w:r>
@@ -26000,6 +26102,68 @@
         <w:pStyle w:val="BodyText"/>
       </w:pPr>
       <w:r>
+        <w:t xml:space="preserve">These limitations mark out an agenda. Panel data would allow the temporal ordering of technological perception and perceived redistributive justice to be established and reverse causation to be assessed directly. Instrumentation that separates concrete from prospective technological risk, and the valence of a perception from the salience of technological change, would clarify the mechanisms behind the displacement anomaly; qualitative inquiry into how platform and own-account workers construct the reference points against which they judge their exchange would do the same for the platform result. Comparative leverage would be improved by replacing categorical regimes with continuous indicators of decommodification and of active labour-market and social-investment provision, which would also permit a more direct test of whether policy feedback, rather than reassurance, underlies the institutional patterning observed here</w:t>
+      </w:r>
+      <w:r>
+        <w:t xml:space="preserve"> </w:t>
+      </w:r>
+      <w:r>
+        <w:t xml:space="preserve">(</w:t>
+      </w:r>
+      <w:hyperlink w:anchor="ref-fan_how_2024">
+        <w:r>
+          <w:rPr>
+            <w:rStyle w:val="Hyperlink"/>
+          </w:rPr>
+          <w:t xml:space="preserve">Fan et al., 2024</w:t>
+        </w:r>
+      </w:hyperlink>
+      <w:r>
+        <w:t xml:space="preserve">;</w:t>
+      </w:r>
+      <w:r>
+        <w:t xml:space="preserve"> </w:t>
+      </w:r>
+      <w:hyperlink w:anchor="ref-gallego_automation_2022">
+        <w:r>
+          <w:rPr>
+            <w:rStyle w:val="Hyperlink"/>
+          </w:rPr>
+          <w:t xml:space="preserve">Gallego and Kurer, 2022</w:t>
+        </w:r>
+      </w:hyperlink>
+      <w:r>
+        <w:t xml:space="preserve">)</w:t>
+      </w:r>
+      <w:r>
+        <w:t xml:space="preserve">. Greater attention to within-regime heterogeneity, particularly in the commodified welfare states of Latin America, would test the generalisability of the decoupling thesis beyond the European core</w:t>
+      </w:r>
+      <w:r>
+        <w:t xml:space="preserve"> </w:t>
+      </w:r>
+      <w:r>
+        <w:t xml:space="preserve">(</w:t>
+      </w:r>
+      <w:hyperlink w:anchor="ref-perez-ahumada_conditioning_2026">
+        <w:r>
+          <w:rPr>
+            <w:rStyle w:val="Hyperlink"/>
+          </w:rPr>
+          <w:t xml:space="preserve">Pérez-Ahumada et al., 2026</w:t>
+        </w:r>
+      </w:hyperlink>
+      <w:r>
+        <w:t xml:space="preserve">)</w:t>
+      </w:r>
+      <w:r>
+        <w:t xml:space="preserve">.</w:t>
+      </w:r>
+    </w:p>
+    <w:p>
+      <w:pPr>
+        <w:pStyle w:val="BodyText"/>
+      </w:pPr>
+      <w:r>
         <w:t xml:space="preserve">The legitimacy of the welfare state in the digital transition appears to depend less on the objective pace of automation than on whether institutions can prevent perceived redistributive justice from fragmenting along individual labour-market lines. On the evidence presented here, universalist designs are better able to do so. As digitalisation continues to remake the standard employment relationship around which social protection was built</w:t>
       </w:r>
       <w:r>
@@ -26020,11 +26184,11 @@
         <w:t xml:space="preserve">)</w:t>
       </w:r>
       <w:r>
-        <w:t xml:space="preserve">, how perceived justice is distributed across the workforce, not only how much redistribution citizens wan, is likely to become a central question for the comparative study of welfare legitimacy.</w:t>
+        <w:t xml:space="preserve">, how perceived justice is distributed across the workforce, not only how much redistribution citizens want, is likely to become a central question for the comparative study of welfare legitimacy.</w:t>
       </w:r>
     </w:p>
-    <w:bookmarkEnd w:id="42"/>
-    <w:bookmarkStart w:id="182" w:name="references"/>
+    <w:bookmarkEnd w:id="43"/>
+    <w:bookmarkStart w:id="183" w:name="references"/>
     <w:p>
       <w:pPr>
         <w:pStyle w:val="Heading1"/>
@@ -26033,8 +26197,8 @@
         <w:t xml:space="preserve">6. References</w:t>
       </w:r>
     </w:p>
-    <w:bookmarkStart w:id="181" w:name="refs"/>
-    <w:bookmarkStart w:id="44" w:name="ref-aidukaite_welfare_2011"/>
+    <w:bookmarkStart w:id="182" w:name="refs"/>
+    <w:bookmarkStart w:id="45" w:name="ref-aidukaite_welfare_2011"/>
     <w:p>
       <w:pPr>
         <w:pStyle w:val="Bibliography"/>
@@ -26045,7 +26209,7 @@
       <w:r>
         <w:t xml:space="preserve"> </w:t>
       </w:r>
-      <w:hyperlink r:id="rId43">
+      <w:hyperlink r:id="rId44">
         <w:r>
           <w:rPr>
             <w:rStyle w:val="Hyperlink"/>
@@ -26133,8 +26297,8 @@
         <w:t xml:space="preserve">44(3): 211–219.</w:t>
       </w:r>
     </w:p>
-    <w:bookmarkEnd w:id="44"/>
-    <w:bookmarkStart w:id="46" w:name="ref-anderson_workers_2007"/>
+    <w:bookmarkEnd w:id="45"/>
+    <w:bookmarkStart w:id="47" w:name="ref-anderson_workers_2007"/>
     <w:p>
       <w:pPr>
         <w:pStyle w:val="Bibliography"/>
@@ -26145,7 +26309,7 @@
       <w:r>
         <w:t xml:space="preserve"> </w:t>
       </w:r>
-      <w:hyperlink r:id="rId45">
+      <w:hyperlink r:id="rId46">
         <w:r>
           <w:rPr>
             <w:rStyle w:val="Hyperlink"/>
@@ -26221,8 +26385,8 @@
         <w:t xml:space="preserve">46(2): 211–235.</w:t>
       </w:r>
     </w:p>
-    <w:bookmarkEnd w:id="46"/>
-    <w:bookmarkStart w:id="48" w:name="ref-arntz_risk_2016"/>
+    <w:bookmarkEnd w:id="47"/>
+    <w:bookmarkStart w:id="49" w:name="ref-arntz_risk_2016"/>
     <w:p>
       <w:pPr>
         <w:pStyle w:val="Bibliography"/>
@@ -26233,7 +26397,7 @@
       <w:r>
         <w:t xml:space="preserve"> </w:t>
       </w:r>
-      <w:hyperlink r:id="rId47">
+      <w:hyperlink r:id="rId48">
         <w:r>
           <w:rPr>
             <w:rStyle w:val="Hyperlink"/>
@@ -26416,8 +26580,8 @@
         <w:t xml:space="preserve">189, {{OECD Social}}, {{Employment}} and {{Migration Working Papers}}, May.</w:t>
       </w:r>
     </w:p>
-    <w:bookmarkEnd w:id="48"/>
-    <w:bookmarkStart w:id="50" w:name="ref-arts_three_2002"/>
+    <w:bookmarkEnd w:id="49"/>
+    <w:bookmarkStart w:id="51" w:name="ref-arts_three_2002"/>
     <w:p>
       <w:pPr>
         <w:pStyle w:val="Bibliography"/>
@@ -26428,7 +26592,7 @@
       <w:r>
         <w:t xml:space="preserve"> </w:t>
       </w:r>
-      <w:hyperlink r:id="rId49">
+      <w:hyperlink r:id="rId50">
         <w:r>
           <w:rPr>
             <w:rStyle w:val="Hyperlink"/>
@@ -26480,8 +26644,8 @@
         <w:t xml:space="preserve">12(2): 137–158.</w:t>
       </w:r>
     </w:p>
-    <w:bookmarkEnd w:id="50"/>
-    <w:bookmarkStart w:id="52" w:name="ref-autor_why_2015"/>
+    <w:bookmarkEnd w:id="51"/>
+    <w:bookmarkStart w:id="53" w:name="ref-autor_why_2015"/>
     <w:p>
       <w:pPr>
         <w:pStyle w:val="Bibliography"/>
@@ -26492,7 +26656,7 @@
       <w:r>
         <w:t xml:space="preserve"> </w:t>
       </w:r>
-      <w:hyperlink r:id="rId51">
+      <w:hyperlink r:id="rId52">
         <w:r>
           <w:rPr>
             <w:rStyle w:val="Hyperlink"/>
@@ -26598,8 +26762,8 @@
         <w:t xml:space="preserve">29(3): 3–30.</w:t>
       </w:r>
     </w:p>
-    <w:bookmarkEnd w:id="52"/>
-    <w:bookmarkStart w:id="54" w:name="ref-bambra_sifting_2007"/>
+    <w:bookmarkEnd w:id="53"/>
+    <w:bookmarkStart w:id="55" w:name="ref-bambra_sifting_2007"/>
     <w:p>
       <w:pPr>
         <w:pStyle w:val="Bibliography"/>
@@ -26610,7 +26774,7 @@
       <w:r>
         <w:t xml:space="preserve"> </w:t>
       </w:r>
-      <w:hyperlink r:id="rId53">
+      <w:hyperlink r:id="rId54">
         <w:r>
           <w:rPr>
             <w:rStyle w:val="Hyperlink"/>
@@ -26758,8 +26922,8 @@
         <w:t xml:space="preserve">41(1): 1–28.</w:t>
       </w:r>
     </w:p>
-    <w:bookmarkEnd w:id="54"/>
-    <w:bookmarkStart w:id="56" w:name="ref-behrendt_social_2019"/>
+    <w:bookmarkEnd w:id="55"/>
+    <w:bookmarkStart w:id="57" w:name="ref-behrendt_social_2019"/>
     <w:p>
       <w:pPr>
         <w:pStyle w:val="Bibliography"/>
@@ -26770,7 +26934,7 @@
       <w:r>
         <w:t xml:space="preserve"> </w:t>
       </w:r>
-      <w:hyperlink r:id="rId55">
+      <w:hyperlink r:id="rId56">
         <w:r>
           <w:rPr>
             <w:rStyle w:val="Hyperlink"/>
@@ -26822,8 +26986,8 @@
         <w:t xml:space="preserve">72(3): 17–41.</w:t>
       </w:r>
     </w:p>
-    <w:bookmarkEnd w:id="56"/>
-    <w:bookmarkStart w:id="58" w:name="ref-blekesaune_public_2003"/>
+    <w:bookmarkEnd w:id="57"/>
+    <w:bookmarkStart w:id="59" w:name="ref-blekesaune_public_2003"/>
     <w:p>
       <w:pPr>
         <w:pStyle w:val="Bibliography"/>
@@ -26834,7 +26998,7 @@
       <w:r>
         <w:t xml:space="preserve"> </w:t>
       </w:r>
-      <w:hyperlink r:id="rId57">
+      <w:hyperlink r:id="rId58">
         <w:r>
           <w:rPr>
             <w:rStyle w:val="Hyperlink"/>
@@ -26940,8 +27104,8 @@
         <w:t xml:space="preserve">19(5): 415–427.</w:t>
       </w:r>
     </w:p>
-    <w:bookmarkEnd w:id="58"/>
-    <w:bookmarkStart w:id="60" w:name="ref-brougham_smart_2018"/>
+    <w:bookmarkEnd w:id="59"/>
+    <w:bookmarkStart w:id="61" w:name="ref-brougham_smart_2018"/>
     <w:p>
       <w:pPr>
         <w:pStyle w:val="Bibliography"/>
@@ -26952,7 +27116,7 @@
       <w:r>
         <w:t xml:space="preserve"> </w:t>
       </w:r>
-      <w:hyperlink r:id="rId59">
+      <w:hyperlink r:id="rId60">
         <w:r>
           <w:rPr>
             <w:rStyle w:val="Hyperlink"/>
@@ -27088,8 +27252,8 @@
         <w:t xml:space="preserve">24(2): 239–257.</w:t>
       </w:r>
     </w:p>
-    <w:bookmarkEnd w:id="60"/>
-    <w:bookmarkStart w:id="62" w:name="ref-busemeyer_social_2022"/>
+    <w:bookmarkEnd w:id="61"/>
+    <w:bookmarkStart w:id="63" w:name="ref-busemeyer_social_2022"/>
     <w:p>
       <w:pPr>
         <w:pStyle w:val="Bibliography"/>
@@ -27100,7 +27264,7 @@
       <w:r>
         <w:t xml:space="preserve"> </w:t>
       </w:r>
-      <w:hyperlink r:id="rId61">
+      <w:hyperlink r:id="rId62">
         <w:r>
           <w:rPr>
             <w:rStyle w:val="Hyperlink"/>
@@ -27272,8 +27436,8 @@
         <w:t xml:space="preserve">51(4): 751–770.</w:t>
       </w:r>
     </w:p>
-    <w:bookmarkEnd w:id="62"/>
-    <w:bookmarkStart w:id="64" w:name="ref-bustelo_automation_2020"/>
+    <w:bookmarkEnd w:id="63"/>
+    <w:bookmarkStart w:id="65" w:name="ref-bustelo_automation_2020"/>
     <w:p>
       <w:pPr>
         <w:pStyle w:val="Bibliography"/>
@@ -27284,7 +27448,7 @@
       <w:r>
         <w:t xml:space="preserve"> </w:t>
       </w:r>
-      <w:hyperlink r:id="rId63">
+      <w:hyperlink r:id="rId64">
         <w:r>
           <w:rPr>
             <w:rStyle w:val="Hyperlink"/>
@@ -27410,8 +27574,8 @@
         <w:t xml:space="preserve"> August. Inter-American Development Bank.</w:t>
       </w:r>
     </w:p>
-    <w:bookmarkEnd w:id="64"/>
-    <w:bookmarkStart w:id="66" w:name="ref-castillo_perception_2022"/>
+    <w:bookmarkEnd w:id="65"/>
+    <w:bookmarkStart w:id="67" w:name="ref-castillo_perception_2022"/>
     <w:p>
       <w:pPr>
         <w:pStyle w:val="Bibliography"/>
@@ -27422,7 +27586,7 @@
       <w:r>
         <w:t xml:space="preserve"> </w:t>
       </w:r>
-      <w:hyperlink r:id="rId65">
+      <w:hyperlink r:id="rId66">
         <w:r>
           <w:rPr>
             <w:rStyle w:val="Hyperlink"/>
@@ -27468,8 +27632,8 @@
         <w:t xml:space="preserve">37(1): 180–207.</w:t>
       </w:r>
     </w:p>
-    <w:bookmarkEnd w:id="66"/>
-    <w:bookmarkStart w:id="68" w:name="ref-castillo_perceptions_2025"/>
+    <w:bookmarkEnd w:id="67"/>
+    <w:bookmarkStart w:id="69" w:name="ref-castillo_perceptions_2025"/>
     <w:p>
       <w:pPr>
         <w:pStyle w:val="Bibliography"/>
@@ -27480,7 +27644,7 @@
       <w:r>
         <w:t xml:space="preserve"> </w:t>
       </w:r>
-      <w:hyperlink r:id="rId67">
+      <w:hyperlink r:id="rId68">
         <w:r>
           <w:rPr>
             <w:rStyle w:val="Hyperlink"/>
@@ -27532,8 +27696,8 @@
         <w:t xml:space="preserve">10: 1634219.</w:t>
       </w:r>
     </w:p>
-    <w:bookmarkEnd w:id="68"/>
-    <w:bookmarkStart w:id="70" w:name="ref-cavaille_fair_2025"/>
+    <w:bookmarkEnd w:id="69"/>
+    <w:bookmarkStart w:id="71" w:name="ref-cavaille_fair_2025"/>
     <w:p>
       <w:pPr>
         <w:pStyle w:val="Bibliography"/>
@@ -27544,7 +27708,7 @@
       <w:r>
         <w:t xml:space="preserve"> </w:t>
       </w:r>
-      <w:hyperlink r:id="rId69">
+      <w:hyperlink r:id="rId70">
         <w:r>
           <w:rPr>
             <w:rStyle w:val="Hyperlink"/>
@@ -27694,8 +27858,8 @@
         <w:t xml:space="preserve">. 1st edn Cambridge University Press.</w:t>
       </w:r>
     </w:p>
-    <w:bookmarkEnd w:id="70"/>
-    <w:bookmarkStart w:id="72" w:name="ref-chung_institutions_2011"/>
+    <w:bookmarkEnd w:id="71"/>
+    <w:bookmarkStart w:id="73" w:name="ref-chung_institutions_2011"/>
     <w:p>
       <w:pPr>
         <w:pStyle w:val="Bibliography"/>
@@ -27706,7 +27870,7 @@
       <w:r>
         <w:t xml:space="preserve"> </w:t>
       </w:r>
-      <w:hyperlink r:id="rId71">
+      <w:hyperlink r:id="rId72">
         <w:r>
           <w:rPr>
             <w:rStyle w:val="Hyperlink"/>
@@ -27782,8 +27946,8 @@
         <w:t xml:space="preserve">21(4): 287–301.</w:t>
       </w:r>
     </w:p>
-    <w:bookmarkEnd w:id="72"/>
-    <w:bookmarkStart w:id="73" w:name="X8f09c96f00ce2967a1485d0ccd3bfdbc82ad32c"/>
+    <w:bookmarkEnd w:id="73"/>
+    <w:bookmarkStart w:id="74" w:name="X8f09c96f00ce2967a1485d0ccd3bfdbc82ad32c"/>
     <w:p>
       <w:pPr>
         <w:pStyle w:val="Bibliography"/>
@@ -27825,8 +27989,8 @@
         <w:t xml:space="preserve">387/01). Official Journal of the European Union, C 387, 15 November 2019, pp. 1–8.</w:t>
       </w:r>
     </w:p>
-    <w:bookmarkEnd w:id="73"/>
-    <w:bookmarkStart w:id="75" w:name="ref-cusack_risks_2006"/>
+    <w:bookmarkEnd w:id="74"/>
+    <w:bookmarkStart w:id="76" w:name="ref-cusack_risks_2006"/>
     <w:p>
       <w:pPr>
         <w:pStyle w:val="Bibliography"/>
@@ -27837,7 +28001,7 @@
       <w:r>
         <w:t xml:space="preserve"> </w:t>
       </w:r>
-      <w:hyperlink r:id="rId74">
+      <w:hyperlink r:id="rId75">
         <w:r>
           <w:rPr>
             <w:rStyle w:val="Hyperlink"/>
@@ -27943,8 +28107,8 @@
         <w:t xml:space="preserve">22(3): 365–389.</w:t>
       </w:r>
     </w:p>
-    <w:bookmarkEnd w:id="75"/>
-    <w:bookmarkStart w:id="77" w:name="ref-dewitte_job_2005"/>
+    <w:bookmarkEnd w:id="76"/>
+    <w:bookmarkStart w:id="78" w:name="ref-dewitte_job_2005"/>
     <w:p>
       <w:pPr>
         <w:pStyle w:val="Bibliography"/>
@@ -27955,7 +28119,7 @@
       <w:r>
         <w:t xml:space="preserve"> </w:t>
       </w:r>
-      <w:hyperlink r:id="rId76">
+      <w:hyperlink r:id="rId77">
         <w:r>
           <w:rPr>
             <w:rStyle w:val="Hyperlink"/>
@@ -28007,8 +28171,8 @@
         <w:t xml:space="preserve">31(4).</w:t>
       </w:r>
     </w:p>
-    <w:bookmarkEnd w:id="77"/>
-    <w:bookmarkStart w:id="79" w:name="ref-dekker_fear_2017"/>
+    <w:bookmarkEnd w:id="78"/>
+    <w:bookmarkStart w:id="80" w:name="ref-dekker_fear_2017"/>
     <w:p>
       <w:pPr>
         <w:pStyle w:val="Bibliography"/>
@@ -28019,7 +28183,7 @@
       <w:r>
         <w:t xml:space="preserve"> </w:t>
       </w:r>
-      <w:hyperlink r:id="rId78">
+      <w:hyperlink r:id="rId79">
         <w:r>
           <w:rPr>
             <w:rStyle w:val="Hyperlink"/>
@@ -28047,8 +28211,8 @@
         <w:t xml:space="preserve">15(3): 539–562.</w:t>
       </w:r>
     </w:p>
-    <w:bookmarkEnd w:id="79"/>
-    <w:bookmarkStart w:id="81" w:name="ref-emmenegger_age_2012"/>
+    <w:bookmarkEnd w:id="80"/>
+    <w:bookmarkStart w:id="82" w:name="ref-emmenegger_age_2012"/>
     <w:p>
       <w:pPr>
         <w:pStyle w:val="Bibliography"/>
@@ -28059,7 +28223,7 @@
       <w:r>
         <w:t xml:space="preserve"> </w:t>
       </w:r>
-      <w:hyperlink r:id="rId80">
+      <w:hyperlink r:id="rId81">
         <w:r>
           <w:rPr>
             <w:rStyle w:val="Hyperlink"/>
@@ -28076,8 +28240,8 @@
         <w:t xml:space="preserve">(eds P Emmenegger, S Häusermann, B Palier, et al.). Oxford University Press.</w:t>
       </w:r>
     </w:p>
-    <w:bookmarkEnd w:id="81"/>
-    <w:bookmarkStart w:id="82" w:name="ref-esping-andersen_three_1993"/>
+    <w:bookmarkEnd w:id="82"/>
+    <w:bookmarkStart w:id="83" w:name="ref-esping-andersen_three_1993"/>
     <w:p>
       <w:pPr>
         <w:pStyle w:val="Bibliography"/>
@@ -28099,8 +28263,8 @@
         <w:t xml:space="preserve">. Cambridge: Polity press.</w:t>
       </w:r>
     </w:p>
-    <w:bookmarkEnd w:id="82"/>
-    <w:bookmarkStart w:id="83" w:name="X84184924b7d64ffb4d0b8e850c04b813ecf2c5f"/>
+    <w:bookmarkEnd w:id="83"/>
+    <w:bookmarkStart w:id="84" w:name="X84184924b7d64ffb4d0b8e850c04b813ecf2c5f"/>
     <w:p>
       <w:pPr>
         <w:pStyle w:val="Bibliography"/>
@@ -28172,8 +28336,8 @@
         <w:t xml:space="preserve">relevance). Official Journal of the European Union, L series, 11 November 2024.</w:t>
       </w:r>
     </w:p>
-    <w:bookmarkEnd w:id="83"/>
-    <w:bookmarkStart w:id="85" w:name="ref-fan_how_2024"/>
+    <w:bookmarkEnd w:id="84"/>
+    <w:bookmarkStart w:id="86" w:name="ref-fan_how_2024"/>
     <w:p>
       <w:pPr>
         <w:pStyle w:val="Bibliography"/>
@@ -28184,7 +28348,7 @@
       <w:r>
         <w:t xml:space="preserve"> </w:t>
       </w:r>
-      <w:hyperlink r:id="rId84">
+      <w:hyperlink r:id="rId85">
         <w:r>
           <w:rPr>
             <w:rStyle w:val="Hyperlink"/>
@@ -28290,8 +28454,8 @@
         <w:t xml:space="preserve">23(3): 750–768.</w:t>
       </w:r>
     </w:p>
-    <w:bookmarkEnd w:id="85"/>
-    <w:bookmarkStart w:id="86" w:name="ref-Fenger2006WelfareRI"/>
+    <w:bookmarkEnd w:id="86"/>
+    <w:bookmarkStart w:id="87" w:name="ref-Fenger2006WelfareRI"/>
     <w:p>
       <w:pPr>
         <w:pStyle w:val="Bibliography"/>
@@ -28312,8 +28476,8 @@
         <w:t xml:space="preserve">post-communist countries in a welfare regime typology. In: 2006.</w:t>
       </w:r>
     </w:p>
-    <w:bookmarkEnd w:id="86"/>
-    <w:bookmarkStart w:id="88" w:name="ref-ferrera_southern_1996"/>
+    <w:bookmarkEnd w:id="87"/>
+    <w:bookmarkStart w:id="89" w:name="ref-ferrera_southern_1996"/>
     <w:p>
       <w:pPr>
         <w:pStyle w:val="Bibliography"/>
@@ -28324,7 +28488,7 @@
       <w:r>
         <w:t xml:space="preserve"> </w:t>
       </w:r>
-      <w:hyperlink r:id="rId87">
+      <w:hyperlink r:id="rId88">
         <w:r>
           <w:rPr>
             <w:rStyle w:val="Hyperlink"/>
@@ -28400,8 +28564,8 @@
         <w:t xml:space="preserve">6(1): 17–37.</w:t>
       </w:r>
     </w:p>
-    <w:bookmarkEnd w:id="88"/>
-    <w:bookmarkStart w:id="90" w:name="ref-finseraas_income_2009"/>
+    <w:bookmarkEnd w:id="89"/>
+    <w:bookmarkStart w:id="91" w:name="ref-finseraas_income_2009"/>
     <w:p>
       <w:pPr>
         <w:pStyle w:val="Bibliography"/>
@@ -28412,7 +28576,7 @@
       <w:r>
         <w:t xml:space="preserve"> </w:t>
       </w:r>
-      <w:hyperlink r:id="rId89">
+      <w:hyperlink r:id="rId90">
         <w:r>
           <w:rPr>
             <w:rStyle w:val="Hyperlink"/>
@@ -28542,8 +28706,8 @@
         <w:t xml:space="preserve">32(1): 94–119.</w:t>
       </w:r>
     </w:p>
-    <w:bookmarkEnd w:id="90"/>
-    <w:bookmarkStart w:id="92" w:name="ref-frey_future_2017"/>
+    <w:bookmarkEnd w:id="91"/>
+    <w:bookmarkStart w:id="93" w:name="ref-frey_future_2017"/>
     <w:p>
       <w:pPr>
         <w:pStyle w:val="Bibliography"/>
@@ -28554,7 +28718,7 @@
       <w:r>
         <w:t xml:space="preserve"> </w:t>
       </w:r>
-      <w:hyperlink r:id="rId91">
+      <w:hyperlink r:id="rId92">
         <w:r>
           <w:rPr>
             <w:rStyle w:val="Hyperlink"/>
@@ -28603,8 +28767,8 @@
         <w:t xml:space="preserve">114: 254–280.</w:t>
       </w:r>
     </w:p>
-    <w:bookmarkEnd w:id="92"/>
-    <w:bookmarkStart w:id="94" w:name="ref-gallego_automation_2022"/>
+    <w:bookmarkEnd w:id="93"/>
+    <w:bookmarkStart w:id="95" w:name="ref-gallego_automation_2022"/>
     <w:p>
       <w:pPr>
         <w:pStyle w:val="Bibliography"/>
@@ -28615,7 +28779,7 @@
       <w:r>
         <w:t xml:space="preserve"> </w:t>
       </w:r>
-      <w:hyperlink r:id="rId93">
+      <w:hyperlink r:id="rId94">
         <w:r>
           <w:rPr>
             <w:rStyle w:val="Hyperlink"/>
@@ -28739,8 +28903,8 @@
         <w:t xml:space="preserve">25(1): 463–484.</w:t>
       </w:r>
     </w:p>
-    <w:bookmarkEnd w:id="94"/>
-    <w:bookmarkStart w:id="96" w:name="ref-gallie_economic_2013"/>
+    <w:bookmarkEnd w:id="95"/>
+    <w:bookmarkStart w:id="97" w:name="ref-gallie_economic_2013"/>
     <w:p>
       <w:pPr>
         <w:pStyle w:val="Bibliography"/>
@@ -28751,7 +28915,7 @@
       <w:r>
         <w:t xml:space="preserve"> </w:t>
       </w:r>
-      <w:hyperlink r:id="rId95">
+      <w:hyperlink r:id="rId96">
         <w:r>
           <w:rPr>
             <w:rStyle w:val="Hyperlink"/>
@@ -28885,8 +29049,8 @@
         <w:t xml:space="preserve">. Oxford University Press.</w:t>
       </w:r>
     </w:p>
-    <w:bookmarkEnd w:id="96"/>
-    <w:bookmarkStart w:id="98" w:name="ref-garcia-castro_perceiving_2020"/>
+    <w:bookmarkEnd w:id="97"/>
+    <w:bookmarkStart w:id="99" w:name="ref-garcia-castro_perceiving_2020"/>
     <w:p>
       <w:pPr>
         <w:pStyle w:val="Bibliography"/>
@@ -28897,7 +29061,7 @@
       <w:r>
         <w:t xml:space="preserve"> </w:t>
       </w:r>
-      <w:hyperlink r:id="rId97">
+      <w:hyperlink r:id="rId98">
         <w:r>
           <w:rPr>
             <w:rStyle w:val="Hyperlink"/>
@@ -28925,8 +29089,8 @@
         <w:t xml:space="preserve">90: 104019.</w:t>
       </w:r>
     </w:p>
-    <w:bookmarkEnd w:id="98"/>
-    <w:bookmarkStart w:id="100" w:name="ref-garcia-sanchez_attitudes_2020"/>
+    <w:bookmarkEnd w:id="99"/>
+    <w:bookmarkStart w:id="101" w:name="ref-garcia-sanchez_attitudes_2020"/>
     <w:p>
       <w:pPr>
         <w:pStyle w:val="Bibliography"/>
@@ -28937,7 +29101,7 @@
       <w:r>
         <w:t xml:space="preserve"> </w:t>
       </w:r>
-      <w:hyperlink r:id="rId99">
+      <w:hyperlink r:id="rId100">
         <w:r>
           <w:rPr>
             <w:rStyle w:val="Hyperlink"/>
@@ -28965,8 +29129,8 @@
         <w:t xml:space="preserve">59(1): 111–136.</w:t>
       </w:r>
     </w:p>
-    <w:bookmarkEnd w:id="100"/>
-    <w:bookmarkStart w:id="102" w:name="ref-gimpelson_misperceiving_2018"/>
+    <w:bookmarkEnd w:id="101"/>
+    <w:bookmarkStart w:id="103" w:name="ref-gimpelson_misperceiving_2018"/>
     <w:p>
       <w:pPr>
         <w:pStyle w:val="Bibliography"/>
@@ -28977,7 +29141,7 @@
       <w:r>
         <w:t xml:space="preserve"> </w:t>
       </w:r>
-      <w:hyperlink r:id="rId101">
+      <w:hyperlink r:id="rId102">
         <w:r>
           <w:rPr>
             <w:rStyle w:val="Hyperlink"/>
@@ -29005,8 +29169,8 @@
         <w:t xml:space="preserve">30(1): 27–54.</w:t>
       </w:r>
     </w:p>
-    <w:bookmarkEnd w:id="102"/>
-    <w:bookmarkStart w:id="104" w:name="ref-gutierrezcrocco_effects_2022"/>
+    <w:bookmarkEnd w:id="103"/>
+    <w:bookmarkStart w:id="105" w:name="ref-gutierrezcrocco_effects_2022"/>
     <w:p>
       <w:pPr>
         <w:pStyle w:val="Bibliography"/>
@@ -29017,7 +29181,7 @@
       <w:r>
         <w:t xml:space="preserve"> </w:t>
       </w:r>
-      <w:hyperlink r:id="rId103">
+      <w:hyperlink r:id="rId104">
         <w:r>
           <w:rPr>
             <w:rStyle w:val="Hyperlink"/>
@@ -29105,8 +29269,8 @@
         <w:t xml:space="preserve">161(3): 441–461.</w:t>
       </w:r>
     </w:p>
-    <w:bookmarkEnd w:id="104"/>
-    <w:bookmarkStart w:id="105" w:name="ref-haubo_cumulative_2018"/>
+    <w:bookmarkEnd w:id="105"/>
+    <w:bookmarkStart w:id="106" w:name="ref-haubo_cumulative_2018"/>
     <w:p>
       <w:pPr>
         <w:pStyle w:val="Bibliography"/>
@@ -29127,8 +29291,8 @@
         <w:t xml:space="preserve">package ordinal. In: 2018.</w:t>
       </w:r>
     </w:p>
-    <w:bookmarkEnd w:id="105"/>
-    <w:bookmarkStart w:id="107" w:name="ref-howcroft_digitalisation_2025"/>
+    <w:bookmarkEnd w:id="106"/>
+    <w:bookmarkStart w:id="108" w:name="ref-howcroft_digitalisation_2025"/>
     <w:p>
       <w:pPr>
         <w:pStyle w:val="Bibliography"/>
@@ -29139,7 +29303,7 @@
       <w:r>
         <w:t xml:space="preserve"> </w:t>
       </w:r>
-      <w:hyperlink r:id="rId106">
+      <w:hyperlink r:id="rId107">
         <w:r>
           <w:rPr>
             <w:rStyle w:val="Hyperlink"/>
@@ -29203,8 +29367,8 @@
         <w:t xml:space="preserve">39(3): 703–726.</w:t>
       </w:r>
     </w:p>
-    <w:bookmarkEnd w:id="107"/>
-    <w:bookmarkStart w:id="109" w:name="ref-hox_multilevel_2017"/>
+    <w:bookmarkEnd w:id="108"/>
+    <w:bookmarkStart w:id="110" w:name="ref-hox_multilevel_2017"/>
     <w:p>
       <w:pPr>
         <w:pStyle w:val="Bibliography"/>
@@ -29215,7 +29379,7 @@
       <w:r>
         <w:t xml:space="preserve"> </w:t>
       </w:r>
-      <w:hyperlink r:id="rId108">
+      <w:hyperlink r:id="rId109">
         <w:r>
           <w:rPr>
             <w:rStyle w:val="Hyperlink"/>
@@ -29316,8 +29480,8 @@
         <w:t xml:space="preserve">: Routledge.</w:t>
       </w:r>
     </w:p>
-    <w:bookmarkEnd w:id="109"/>
-    <w:bookmarkStart w:id="111" w:name="ref-im_losers_2019"/>
+    <w:bookmarkEnd w:id="110"/>
+    <w:bookmarkStart w:id="112" w:name="ref-im_losers_2019"/>
     <w:p>
       <w:pPr>
         <w:pStyle w:val="Bibliography"/>
@@ -29328,7 +29492,7 @@
       <w:r>
         <w:t xml:space="preserve"> </w:t>
       </w:r>
-      <w:hyperlink r:id="rId110">
+      <w:hyperlink r:id="rId111">
         <w:r>
           <w:rPr>
             <w:rStyle w:val="Hyperlink"/>
@@ -29395,8 +29559,8 @@
         <w:t xml:space="preserve">6(1): 2053168018822395.</w:t>
       </w:r>
     </w:p>
-    <w:bookmarkEnd w:id="111"/>
-    <w:bookmarkStart w:id="113" w:name="ref-iversen_asset_2001"/>
+    <w:bookmarkEnd w:id="112"/>
+    <w:bookmarkStart w:id="114" w:name="ref-iversen_asset_2001"/>
     <w:p>
       <w:pPr>
         <w:pStyle w:val="Bibliography"/>
@@ -29407,7 +29571,7 @@
       <w:r>
         <w:t xml:space="preserve"> </w:t>
       </w:r>
-      <w:hyperlink r:id="rId112">
+      <w:hyperlink r:id="rId113">
         <w:r>
           <w:rPr>
             <w:rStyle w:val="Hyperlink"/>
@@ -29471,8 +29635,8 @@
         <w:t xml:space="preserve">95(4): 875–893.</w:t>
       </w:r>
     </w:p>
-    <w:bookmarkEnd w:id="113"/>
-    <w:bookmarkStart w:id="115" w:name="ref-jaeger_welfare_2006"/>
+    <w:bookmarkEnd w:id="114"/>
+    <w:bookmarkStart w:id="116" w:name="ref-jaeger_welfare_2006"/>
     <w:p>
       <w:pPr>
         <w:pStyle w:val="Bibliography"/>
@@ -29483,7 +29647,7 @@
       <w:r>
         <w:t xml:space="preserve"> </w:t>
       </w:r>
-      <w:hyperlink r:id="rId114">
+      <w:hyperlink r:id="rId115">
         <w:r>
           <w:rPr>
             <w:rStyle w:val="Hyperlink"/>
@@ -29565,8 +29729,8 @@
         <w:t xml:space="preserve">22(2): 157–170.</w:t>
       </w:r>
     </w:p>
-    <w:bookmarkEnd w:id="115"/>
-    <w:bookmarkStart w:id="116" w:name="ref-kalleberg_good_2011"/>
+    <w:bookmarkEnd w:id="116"/>
+    <w:bookmarkStart w:id="117" w:name="ref-kalleberg_good_2011"/>
     <w:p>
       <w:pPr>
         <w:pStyle w:val="Bibliography"/>
@@ -29637,8 +29801,8 @@
         <w:t xml:space="preserve">.</w:t>
       </w:r>
     </w:p>
-    <w:bookmarkEnd w:id="116"/>
-    <w:bookmarkStart w:id="118" w:name="ref-kenworthy_inequality_2007"/>
+    <w:bookmarkEnd w:id="117"/>
+    <w:bookmarkStart w:id="119" w:name="ref-kenworthy_inequality_2007"/>
     <w:p>
       <w:pPr>
         <w:pStyle w:val="Bibliography"/>
@@ -29649,7 +29813,7 @@
       <w:r>
         <w:t xml:space="preserve"> </w:t>
       </w:r>
-      <w:hyperlink r:id="rId117">
+      <w:hyperlink r:id="rId118">
         <w:r>
           <w:rPr>
             <w:rStyle w:val="Hyperlink"/>
@@ -29677,8 +29841,8 @@
         <w:t xml:space="preserve">6(1): 35–68.</w:t>
       </w:r>
     </w:p>
-    <w:bookmarkEnd w:id="118"/>
-    <w:bookmarkStart w:id="120" w:name="ref-korpi_paradox_1998"/>
+    <w:bookmarkEnd w:id="119"/>
+    <w:bookmarkStart w:id="121" w:name="ref-korpi_paradox_1998"/>
     <w:p>
       <w:pPr>
         <w:pStyle w:val="Bibliography"/>
@@ -29689,7 +29853,7 @@
       <w:r>
         <w:t xml:space="preserve"> </w:t>
       </w:r>
-      <w:hyperlink r:id="rId119">
+      <w:hyperlink r:id="rId120">
         <w:r>
           <w:rPr>
             <w:rStyle w:val="Hyperlink"/>
@@ -29879,8 +30043,8 @@
         <w:t xml:space="preserve">63(5): 661.</w:t>
       </w:r>
     </w:p>
-    <w:bookmarkEnd w:id="120"/>
-    <w:bookmarkStart w:id="122" w:name="ref-kurer_declining_2020"/>
+    <w:bookmarkEnd w:id="121"/>
+    <w:bookmarkStart w:id="123" w:name="ref-kurer_declining_2020"/>
     <w:p>
       <w:pPr>
         <w:pStyle w:val="Bibliography"/>
@@ -29891,7 +30055,7 @@
       <w:r>
         <w:t xml:space="preserve"> </w:t>
       </w:r>
-      <w:hyperlink r:id="rId121">
+      <w:hyperlink r:id="rId122">
         <w:r>
           <w:rPr>
             <w:rStyle w:val="Hyperlink"/>
@@ -29985,8 +30149,8 @@
         <w:t xml:space="preserve">53(10-11): 1798–1835.</w:t>
       </w:r>
     </w:p>
-    <w:bookmarkEnd w:id="122"/>
-    <w:bookmarkStart w:id="123" w:name="ref-laenen_welfare_2020"/>
+    <w:bookmarkEnd w:id="123"/>
+    <w:bookmarkStart w:id="124" w:name="ref-laenen_welfare_2020"/>
     <w:p>
       <w:pPr>
         <w:pStyle w:val="Bibliography"/>
@@ -30008,8 +30172,8 @@
         <w:t xml:space="preserve">. Cheltenham, UK Northampton, MA, USA: Edward Elgar Publishing.</w:t>
       </w:r>
     </w:p>
-    <w:bookmarkEnd w:id="123"/>
-    <w:bookmarkStart w:id="125" w:name="ref-larsen_institutional_2008"/>
+    <w:bookmarkEnd w:id="124"/>
+    <w:bookmarkStart w:id="126" w:name="ref-larsen_institutional_2008"/>
     <w:p>
       <w:pPr>
         <w:pStyle w:val="Bibliography"/>
@@ -30020,7 +30184,7 @@
       <w:r>
         <w:t xml:space="preserve"> </w:t>
       </w:r>
-      <w:hyperlink r:id="rId124">
+      <w:hyperlink r:id="rId125">
         <w:r>
           <w:rPr>
             <w:rStyle w:val="Hyperlink"/>
@@ -30102,8 +30266,8 @@
         <w:t xml:space="preserve">41(2): 145–168.</w:t>
       </w:r>
     </w:p>
-    <w:bookmarkEnd w:id="125"/>
-    <w:bookmarkStart w:id="127" w:name="ref-lenth_emmeans_2017"/>
+    <w:bookmarkEnd w:id="126"/>
+    <w:bookmarkStart w:id="128" w:name="ref-lenth_emmeans_2017"/>
     <w:p>
       <w:pPr>
         <w:pStyle w:val="Bibliography"/>
@@ -30114,7 +30278,7 @@
       <w:r>
         <w:t xml:space="preserve"> </w:t>
       </w:r>
-      <w:hyperlink r:id="rId126">
+      <w:hyperlink r:id="rId127">
         <w:r>
           <w:rPr>
             <w:rStyle w:val="Hyperlink"/>
@@ -30156,8 +30320,8 @@
         <w:t xml:space="preserve">. Comprehensive R Archive Network.</w:t>
       </w:r>
     </w:p>
-    <w:bookmarkEnd w:id="127"/>
-    <w:bookmarkStart w:id="129" w:name="ref-lindh_class_2020"/>
+    <w:bookmarkEnd w:id="128"/>
+    <w:bookmarkStart w:id="130" w:name="ref-lindh_class_2020"/>
     <w:p>
       <w:pPr>
         <w:pStyle w:val="Bibliography"/>
@@ -30168,7 +30332,7 @@
       <w:r>
         <w:t xml:space="preserve"> </w:t>
       </w:r>
-      <w:hyperlink r:id="rId128">
+      <w:hyperlink r:id="rId129">
         <w:r>
           <w:rPr>
             <w:rStyle w:val="Hyperlink"/>
@@ -30256,8 +30420,8 @@
         <w:t xml:space="preserve">46(1): 419–441.</w:t>
       </w:r>
     </w:p>
-    <w:bookmarkEnd w:id="129"/>
-    <w:bookmarkStart w:id="131" w:name="ref-franzoni_welfare_2008"/>
+    <w:bookmarkEnd w:id="130"/>
+    <w:bookmarkStart w:id="132" w:name="ref-franzoni_welfare_2008"/>
     <w:p>
       <w:pPr>
         <w:pStyle w:val="Bibliography"/>
@@ -30268,7 +30432,7 @@
       <w:r>
         <w:t xml:space="preserve"> </w:t>
       </w:r>
-      <w:hyperlink r:id="rId130">
+      <w:hyperlink r:id="rId131">
         <w:r>
           <w:rPr>
             <w:rStyle w:val="Hyperlink"/>
@@ -30410,8 +30574,8 @@
         <w:t xml:space="preserve">50(02): 67–100.</w:t>
       </w:r>
     </w:p>
-    <w:bookmarkEnd w:id="131"/>
-    <w:bookmarkStart w:id="133" w:name="ref-marx_effect_2014"/>
+    <w:bookmarkEnd w:id="132"/>
+    <w:bookmarkStart w:id="134" w:name="ref-marx_effect_2014"/>
     <w:p>
       <w:pPr>
         <w:pStyle w:val="Bibliography"/>
@@ -30422,7 +30586,7 @@
       <w:r>
         <w:t xml:space="preserve"> </w:t>
       </w:r>
-      <w:hyperlink r:id="rId132">
+      <w:hyperlink r:id="rId133">
         <w:r>
           <w:rPr>
             <w:rStyle w:val="Hyperlink"/>
@@ -30462,8 +30626,8 @@
         <w:t xml:space="preserve">24(4): 351–366.</w:t>
       </w:r>
     </w:p>
-    <w:bookmarkEnd w:id="133"/>
-    <w:bookmarkStart w:id="134" w:name="ref-mau_moral_2014"/>
+    <w:bookmarkEnd w:id="134"/>
+    <w:bookmarkStart w:id="135" w:name="ref-mau_moral_2014"/>
     <w:p>
       <w:pPr>
         <w:pStyle w:val="Bibliography"/>
@@ -30550,8 +30714,8 @@
         <w:t xml:space="preserve">studies in the political economy of welfare 5. London New York NY: Routledge &amp; Francis Group.</w:t>
       </w:r>
     </w:p>
-    <w:bookmarkEnd w:id="134"/>
-    <w:bookmarkStart w:id="136" w:name="ref-mccall_undeserving_2013"/>
+    <w:bookmarkEnd w:id="135"/>
+    <w:bookmarkStart w:id="137" w:name="ref-mccall_undeserving_2013"/>
     <w:p>
       <w:pPr>
         <w:pStyle w:val="Bibliography"/>
@@ -30562,7 +30726,7 @@
       <w:r>
         <w:t xml:space="preserve"> </w:t>
       </w:r>
-      <w:hyperlink r:id="rId135">
+      <w:hyperlink r:id="rId136">
         <w:r>
           <w:rPr>
             <w:rStyle w:val="Hyperlink"/>
@@ -30696,8 +30860,8 @@
         <w:t xml:space="preserve">. 1st edn Cambridge University Press.</w:t>
       </w:r>
     </w:p>
-    <w:bookmarkEnd w:id="136"/>
-    <w:bookmarkStart w:id="138" w:name="ref-mijs_paradox_2021"/>
+    <w:bookmarkEnd w:id="137"/>
+    <w:bookmarkStart w:id="139" w:name="ref-mijs_paradox_2021"/>
     <w:p>
       <w:pPr>
         <w:pStyle w:val="Bibliography"/>
@@ -30708,7 +30872,7 @@
       <w:r>
         <w:t xml:space="preserve"> </w:t>
       </w:r>
-      <w:hyperlink r:id="rId137">
+      <w:hyperlink r:id="rId138">
         <w:r>
           <w:rPr>
             <w:rStyle w:val="Hyperlink"/>
@@ -30736,8 +30900,8 @@
         <w:t xml:space="preserve">19(1): 7–35.</w:t>
       </w:r>
     </w:p>
-    <w:bookmarkEnd w:id="138"/>
-    <w:bookmarkStart w:id="140" w:name="ref-osberg_fair_2006"/>
+    <w:bookmarkEnd w:id="139"/>
+    <w:bookmarkStart w:id="141" w:name="ref-osberg_fair_2006"/>
     <w:p>
       <w:pPr>
         <w:pStyle w:val="Bibliography"/>
@@ -30748,7 +30912,7 @@
       <w:r>
         <w:t xml:space="preserve"> </w:t>
       </w:r>
-      <w:hyperlink r:id="rId139">
+      <w:hyperlink r:id="rId140">
         <w:r>
           <w:rPr>
             <w:rStyle w:val="Hyperlink"/>
@@ -30884,8 +31048,8 @@
         <w:t xml:space="preserve">71(3): 450–473.</w:t>
       </w:r>
     </w:p>
-    <w:bookmarkEnd w:id="140"/>
-    <w:bookmarkStart w:id="141" w:name="ref-perez_building_2023"/>
+    <w:bookmarkEnd w:id="141"/>
+    <w:bookmarkStart w:id="142" w:name="ref-perez_building_2023"/>
     <w:p>
       <w:pPr>
         <w:pStyle w:val="Bibliography"/>
@@ -30933,8 +31097,8 @@
         <w:t xml:space="preserve">series. Pittsburgh (Pa.): University of Pittsburgh Press.</w:t>
       </w:r>
     </w:p>
-    <w:bookmarkEnd w:id="141"/>
-    <w:bookmarkStart w:id="143" w:name="ref-perez-ahumada_conditioning_2026"/>
+    <w:bookmarkEnd w:id="142"/>
+    <w:bookmarkStart w:id="144" w:name="ref-perez-ahumada_conditioning_2026"/>
     <w:p>
       <w:pPr>
         <w:pStyle w:val="Bibliography"/>
@@ -30945,7 +31109,7 @@
       <w:r>
         <w:t xml:space="preserve"> </w:t>
       </w:r>
-      <w:hyperlink r:id="rId142">
+      <w:hyperlink r:id="rId143">
         <w:r>
           <w:rPr>
             <w:rStyle w:val="Hyperlink"/>
@@ -31018,8 +31182,8 @@
         <w:t xml:space="preserve">: 08969205261417585.</w:t>
       </w:r>
     </w:p>
-    <w:bookmarkEnd w:id="143"/>
-    <w:bookmarkStart w:id="145" w:name="ref-petersen_social_2012"/>
+    <w:bookmarkEnd w:id="144"/>
+    <w:bookmarkStart w:id="146" w:name="ref-petersen_social_2012"/>
     <w:p>
       <w:pPr>
         <w:pStyle w:val="Bibliography"/>
@@ -31030,7 +31194,7 @@
       <w:r>
         <w:t xml:space="preserve"> </w:t>
       </w:r>
-      <w:hyperlink r:id="rId144">
+      <w:hyperlink r:id="rId145">
         <w:r>
           <w:rPr>
             <w:rStyle w:val="Hyperlink"/>
@@ -31148,8 +31312,8 @@
         <w:t xml:space="preserve">56(1): 1–16.</w:t>
       </w:r>
     </w:p>
-    <w:bookmarkEnd w:id="145"/>
-    <w:bookmarkStart w:id="147" w:name="ref-reeskens_equity_2013"/>
+    <w:bookmarkEnd w:id="146"/>
+    <w:bookmarkStart w:id="148" w:name="ref-reeskens_equity_2013"/>
     <w:p>
       <w:pPr>
         <w:pStyle w:val="Bibliography"/>
@@ -31160,7 +31324,7 @@
       <w:r>
         <w:t xml:space="preserve"> </w:t>
       </w:r>
-      <w:hyperlink r:id="rId146">
+      <w:hyperlink r:id="rId147">
         <w:r>
           <w:rPr>
             <w:rStyle w:val="Hyperlink"/>
@@ -31236,8 +31400,8 @@
         <w:t xml:space="preserve">20(8): 1174–1195.</w:t>
       </w:r>
     </w:p>
-    <w:bookmarkEnd w:id="147"/>
-    <w:bookmarkStart w:id="149" w:name="ref-rehm_risks_2009"/>
+    <w:bookmarkEnd w:id="148"/>
+    <w:bookmarkStart w:id="150" w:name="ref-rehm_risks_2009"/>
     <w:p>
       <w:pPr>
         <w:pStyle w:val="Bibliography"/>
@@ -31248,7 +31412,7 @@
       <w:r>
         <w:t xml:space="preserve"> </w:t>
       </w:r>
-      <w:hyperlink r:id="rId148">
+      <w:hyperlink r:id="rId149">
         <w:r>
           <w:rPr>
             <w:rStyle w:val="Hyperlink"/>
@@ -31306,8 +31470,8 @@
         <w:t xml:space="preserve">42(7): 855–881.</w:t>
       </w:r>
     </w:p>
-    <w:bookmarkEnd w:id="149"/>
-    <w:bookmarkStart w:id="151" w:name="ref-roosma_just_2016"/>
+    <w:bookmarkEnd w:id="150"/>
+    <w:bookmarkStart w:id="152" w:name="ref-roosma_just_2016"/>
     <w:p>
       <w:pPr>
         <w:pStyle w:val="Bibliography"/>
@@ -31318,7 +31482,7 @@
       <w:r>
         <w:t xml:space="preserve"> </w:t>
       </w:r>
-      <w:hyperlink r:id="rId150">
+      <w:hyperlink r:id="rId151">
         <w:r>
           <w:rPr>
             <w:rStyle w:val="Hyperlink"/>
@@ -31472,8 +31636,8 @@
         <w:t xml:space="preserve">28(3): 376–400.</w:t>
       </w:r>
     </w:p>
-    <w:bookmarkEnd w:id="151"/>
-    <w:bookmarkStart w:id="153" w:name="ref-rothstein_just_1998"/>
+    <w:bookmarkEnd w:id="152"/>
+    <w:bookmarkStart w:id="154" w:name="ref-rothstein_just_1998"/>
     <w:p>
       <w:pPr>
         <w:pStyle w:val="Bibliography"/>
@@ -31484,7 +31648,7 @@
       <w:r>
         <w:t xml:space="preserve"> </w:t>
       </w:r>
-      <w:hyperlink r:id="rId152">
+      <w:hyperlink r:id="rId153">
         <w:r>
           <w:rPr>
             <w:rStyle w:val="Hyperlink"/>
@@ -31602,8 +31766,8 @@
         <w:t xml:space="preserve">. 1st edn Cambridge University Press.</w:t>
       </w:r>
     </w:p>
-    <w:bookmarkEnd w:id="153"/>
-    <w:bookmarkStart w:id="155" w:name="ref-rueda_social_2007"/>
+    <w:bookmarkEnd w:id="154"/>
+    <w:bookmarkStart w:id="156" w:name="ref-rueda_social_2007"/>
     <w:p>
       <w:pPr>
         <w:pStyle w:val="Bibliography"/>
@@ -31614,7 +31778,7 @@
       <w:r>
         <w:t xml:space="preserve"> </w:t>
       </w:r>
-      <w:hyperlink r:id="rId154">
+      <w:hyperlink r:id="rId155">
         <w:r>
           <w:rPr>
             <w:rStyle w:val="Hyperlink"/>
@@ -31732,8 +31896,8 @@
         <w:t xml:space="preserve">. 1st edn Oxford University PressOxford.</w:t>
       </w:r>
     </w:p>
-    <w:bookmarkEnd w:id="155"/>
-    <w:bookmarkStart w:id="157" w:name="ref-schmidt-catran_economic_2016"/>
+    <w:bookmarkEnd w:id="156"/>
+    <w:bookmarkStart w:id="158" w:name="ref-schmidt-catran_economic_2016"/>
     <w:p>
       <w:pPr>
         <w:pStyle w:val="Bibliography"/>
@@ -31744,7 +31908,7 @@
       <w:r>
         <w:t xml:space="preserve"> </w:t>
       </w:r>
-      <w:hyperlink r:id="rId156">
+      <w:hyperlink r:id="rId157">
         <w:r>
           <w:rPr>
             <w:rStyle w:val="Hyperlink"/>
@@ -31772,8 +31936,8 @@
         <w:t xml:space="preserve">14(1): 119–140.</w:t>
       </w:r>
     </w:p>
-    <w:bookmarkEnd w:id="157"/>
-    <w:bookmarkStart w:id="158" w:name="ref-schor_gig_2020"/>
+    <w:bookmarkEnd w:id="158"/>
+    <w:bookmarkStart w:id="159" w:name="ref-schor_gig_2020"/>
     <w:p>
       <w:pPr>
         <w:pStyle w:val="Bibliography"/>
@@ -31795,8 +31959,8 @@
         <w:t xml:space="preserve">. Oakland, California: University of California Press.</w:t>
       </w:r>
     </w:p>
-    <w:bookmarkEnd w:id="158"/>
-    <w:bookmarkStart w:id="160" w:name="ref-schwander_who_2013"/>
+    <w:bookmarkEnd w:id="159"/>
+    <w:bookmarkStart w:id="161" w:name="ref-schwander_who_2013"/>
     <w:p>
       <w:pPr>
         <w:pStyle w:val="Bibliography"/>
@@ -31807,7 +31971,7 @@
       <w:r>
         <w:t xml:space="preserve"> </w:t>
       </w:r>
-      <w:hyperlink r:id="rId159">
+      <w:hyperlink r:id="rId160">
         <w:r>
           <w:rPr>
             <w:rStyle w:val="Hyperlink"/>
@@ -31859,8 +32023,8 @@
         <w:t xml:space="preserve">23(3): 248–269.</w:t>
       </w:r>
     </w:p>
-    <w:bookmarkEnd w:id="160"/>
-    <w:bookmarkStart w:id="161" w:name="ref-snijders_multilevel_2012"/>
+    <w:bookmarkEnd w:id="161"/>
+    <w:bookmarkStart w:id="162" w:name="ref-snijders_multilevel_2012"/>
     <w:p>
       <w:pPr>
         <w:pStyle w:val="Bibliography"/>
@@ -31882,8 +32046,8 @@
         <w:t xml:space="preserve">. 2nd ed. Los Angeles: Sage.</w:t>
       </w:r>
     </w:p>
-    <w:bookmarkEnd w:id="161"/>
-    <w:bookmarkStart w:id="162" w:name="ref-standing_precariat_2014"/>
+    <w:bookmarkEnd w:id="162"/>
+    <w:bookmarkStart w:id="163" w:name="ref-standing_precariat_2014"/>
     <w:p>
       <w:pPr>
         <w:pStyle w:val="Bibliography"/>
@@ -31905,8 +32069,8 @@
         <w:t xml:space="preserve">. London, UK ; New York, NY: Bloomsbury.</w:t>
       </w:r>
     </w:p>
-    <w:bookmarkEnd w:id="162"/>
-    <w:bookmarkStart w:id="164" w:name="ref-svallfors_worlds_1997"/>
+    <w:bookmarkEnd w:id="163"/>
+    <w:bookmarkStart w:id="165" w:name="ref-svallfors_worlds_1997"/>
     <w:p>
       <w:pPr>
         <w:pStyle w:val="Bibliography"/>
@@ -31917,7 +32081,7 @@
       <w:r>
         <w:t xml:space="preserve"> </w:t>
       </w:r>
-      <w:hyperlink r:id="rId163">
+      <w:hyperlink r:id="rId164">
         <w:r>
           <w:rPr>
             <w:rStyle w:val="Hyperlink"/>
@@ -32047,8 +32211,8 @@
         <w:t xml:space="preserve">13(3): 283–304.</w:t>
       </w:r>
     </w:p>
-    <w:bookmarkEnd w:id="164"/>
-    <w:bookmarkStart w:id="166" w:name="ref-svallfors_government_2013"/>
+    <w:bookmarkEnd w:id="165"/>
+    <w:bookmarkStart w:id="167" w:name="ref-svallfors_government_2013"/>
     <w:p>
       <w:pPr>
         <w:pStyle w:val="Bibliography"/>
@@ -32059,7 +32223,7 @@
       <w:r>
         <w:t xml:space="preserve"> </w:t>
       </w:r>
-      <w:hyperlink r:id="rId165">
+      <w:hyperlink r:id="rId166">
         <w:r>
           <w:rPr>
             <w:rStyle w:val="Hyperlink"/>
@@ -32111,8 +32275,8 @@
         <w:t xml:space="preserve">5(3): 363–380.</w:t>
       </w:r>
     </w:p>
-    <w:bookmarkEnd w:id="166"/>
-    <w:bookmarkStart w:id="168" w:name="ref-sverke_no_2002"/>
+    <w:bookmarkEnd w:id="167"/>
+    <w:bookmarkStart w:id="169" w:name="ref-sverke_no_2002"/>
     <w:p>
       <w:pPr>
         <w:pStyle w:val="Bibliography"/>
@@ -32123,7 +32287,7 @@
       <w:r>
         <w:t xml:space="preserve"> </w:t>
       </w:r>
-      <w:hyperlink r:id="rId167">
+      <w:hyperlink r:id="rId168">
         <w:r>
           <w:rPr>
             <w:rStyle w:val="Hyperlink"/>
@@ -32172,8 +32336,8 @@
         <w:t xml:space="preserve">7(3): 242–264.</w:t>
       </w:r>
     </w:p>
-    <w:bookmarkEnd w:id="168"/>
-    <w:bookmarkStart w:id="170" w:name="ref-thewissen_automation_2019"/>
+    <w:bookmarkEnd w:id="169"/>
+    <w:bookmarkStart w:id="171" w:name="ref-thewissen_automation_2019"/>
     <w:p>
       <w:pPr>
         <w:pStyle w:val="Bibliography"/>
@@ -32184,7 +32348,7 @@
       <w:r>
         <w:t xml:space="preserve"> </w:t>
       </w:r>
-      <w:hyperlink r:id="rId169">
+      <w:hyperlink r:id="rId170">
         <w:r>
           <w:rPr>
             <w:rStyle w:val="Hyperlink"/>
@@ -32290,8 +32454,8 @@
         <w:t xml:space="preserve">52(2): 171–208.</w:t>
       </w:r>
     </w:p>
-    <w:bookmarkEnd w:id="170"/>
-    <w:bookmarkStart w:id="172" w:name="ref-vallas_what_2020"/>
+    <w:bookmarkEnd w:id="171"/>
+    <w:bookmarkStart w:id="173" w:name="ref-vallas_what_2020"/>
     <w:p>
       <w:pPr>
         <w:pStyle w:val="Bibliography"/>
@@ -32302,7 +32466,7 @@
       <w:r>
         <w:t xml:space="preserve"> </w:t>
       </w:r>
-      <w:hyperlink r:id="rId171">
+      <w:hyperlink r:id="rId172">
         <w:r>
           <w:rPr>
             <w:rStyle w:val="Hyperlink"/>
@@ -32384,8 +32548,8 @@
         <w:t xml:space="preserve">46(1): 273–294.</w:t>
       </w:r>
     </w:p>
-    <w:bookmarkEnd w:id="172"/>
-    <w:bookmarkStart w:id="174" w:name="ref-oorschot_who_2000"/>
+    <w:bookmarkEnd w:id="173"/>
+    <w:bookmarkStart w:id="175" w:name="ref-oorschot_who_2000"/>
     <w:p>
       <w:pPr>
         <w:pStyle w:val="Bibliography"/>
@@ -32396,7 +32560,7 @@
       <w:r>
         <w:t xml:space="preserve"> </w:t>
       </w:r>
-      <w:hyperlink r:id="rId173">
+      <w:hyperlink r:id="rId174">
         <w:r>
           <w:rPr>
             <w:rStyle w:val="Hyperlink"/>
@@ -32448,8 +32612,8 @@
         <w:t xml:space="preserve">28(1): 33–48.</w:t>
       </w:r>
     </w:p>
-    <w:bookmarkEnd w:id="174"/>
-    <w:bookmarkStart w:id="176" w:name="ref-vanoorschot_making_2006"/>
+    <w:bookmarkEnd w:id="175"/>
+    <w:bookmarkStart w:id="177" w:name="ref-vanoorschot_making_2006"/>
     <w:p>
       <w:pPr>
         <w:pStyle w:val="Bibliography"/>
@@ -32460,7 +32624,7 @@
       <w:r>
         <w:t xml:space="preserve"> </w:t>
       </w:r>
-      <w:hyperlink r:id="rId175">
+      <w:hyperlink r:id="rId176">
         <w:r>
           <w:rPr>
             <w:rStyle w:val="Hyperlink"/>
@@ -32530,8 +32694,8 @@
         <w:t xml:space="preserve">16(1): 23–42.</w:t>
       </w:r>
     </w:p>
-    <w:bookmarkEnd w:id="176"/>
-    <w:bookmarkStart w:id="178" w:name="ref-vanoorschot_social_2017"/>
+    <w:bookmarkEnd w:id="177"/>
+    <w:bookmarkStart w:id="179" w:name="ref-vanoorschot_social_2017"/>
     <w:p>
       <w:pPr>
         <w:pStyle w:val="Bibliography"/>
@@ -32542,7 +32706,7 @@
       <w:r>
         <w:t xml:space="preserve"> </w:t>
       </w:r>
-      <w:hyperlink r:id="rId177">
+      <w:hyperlink r:id="rId178">
         <w:r>
           <w:rPr>
             <w:rStyle w:val="Hyperlink"/>
@@ -32660,8 +32824,8 @@
         <w:t xml:space="preserve">. Edward Elgar Publishing.</w:t>
       </w:r>
     </w:p>
-    <w:bookmarkEnd w:id="178"/>
-    <w:bookmarkStart w:id="180" w:name="ref-wood_good_2019"/>
+    <w:bookmarkEnd w:id="179"/>
+    <w:bookmarkStart w:id="181" w:name="ref-wood_good_2019"/>
     <w:p>
       <w:pPr>
         <w:pStyle w:val="Bibliography"/>
@@ -32672,7 +32836,7 @@
       <w:r>
         <w:t xml:space="preserve"> </w:t>
       </w:r>
-      <w:hyperlink r:id="rId179">
+      <w:hyperlink r:id="rId180">
         <w:r>
           <w:rPr>
             <w:rStyle w:val="Hyperlink"/>
@@ -32796,9 +32960,9 @@
         <w:t xml:space="preserve">33(1): 56–75.</w:t>
       </w:r>
     </w:p>
-    <w:bookmarkEnd w:id="180"/>
     <w:bookmarkEnd w:id="181"/>
     <w:bookmarkEnd w:id="182"/>
+    <w:bookmarkEnd w:id="183"/>
     <w:sectPr>
       <w:footnotePr>
         <w:numRestart w:val="eachSect"/>

</xml_diff>